<commit_message>
Lab 5: Add Todo types and API service
</commit_message>
<xml_diff>
--- a/інтернет-програмування/Драч_ЛР№5_Звіт.docx
+++ b/інтернет-програмування/Драч_ЛР№5_Звіт.docx
@@ -1531,7 +1531,6 @@
         <w:rPr>
           <w:sz w:val="28"/>
           <w:szCs w:val="28"/>
-          <w:lang w:val="uk-UA"/>
         </w:rPr>
       </w:pPr>
       <w:r>
@@ -1661,6 +1660,193 @@
         </w:rPr>
         <w:t>тільки тоді, коли даних ще взагалі немає і виконується самий перший запит.</w:t>
       </w:r>
+    </w:p>
+    <w:p>
+      <w:pPr>
+        <w:spacing w:after="0"/>
+        <w:rPr>
+          <w:sz w:val="28"/>
+          <w:szCs w:val="28"/>
+        </w:rPr>
+      </w:pPr>
+    </w:p>
+    <w:p>
+      <w:pPr>
+        <w:rPr>
+          <w:sz w:val="28"/>
+          <w:szCs w:val="28"/>
+        </w:rPr>
+      </w:pPr>
+      <w:r>
+        <w:rPr>
+          <w:sz w:val="28"/>
+          <w:szCs w:val="28"/>
+        </w:rPr>
+        <w:br w:type="page"/>
+      </w:r>
+    </w:p>
+    <w:p>
+      <w:pPr>
+        <w:spacing w:after="0"/>
+        <w:rPr>
+          <w:b/>
+          <w:bCs/>
+          <w:sz w:val="28"/>
+          <w:szCs w:val="28"/>
+          <w:lang w:val="uk-UA"/>
+        </w:rPr>
+      </w:pPr>
+      <w:r>
+        <w:rPr>
+          <w:b/>
+          <w:bCs/>
+          <w:sz w:val="28"/>
+          <w:szCs w:val="28"/>
+          <w:lang w:val="uk-UA"/>
+        </w:rPr>
+        <w:lastRenderedPageBreak/>
+        <w:t>Хід роботи:</w:t>
+      </w:r>
+    </w:p>
+    <w:p>
+      <w:pPr>
+        <w:spacing w:after="0"/>
+        <w:rPr>
+          <w:sz w:val="28"/>
+          <w:szCs w:val="28"/>
+          <w:lang w:val="uk-UA"/>
+        </w:rPr>
+      </w:pPr>
+    </w:p>
+    <w:p>
+      <w:pPr>
+        <w:spacing w:after="0"/>
+        <w:rPr>
+          <w:b/>
+          <w:bCs/>
+          <w:sz w:val="28"/>
+          <w:szCs w:val="28"/>
+          <w:lang w:val="uk-UA"/>
+        </w:rPr>
+      </w:pPr>
+      <w:r>
+        <w:rPr>
+          <w:b/>
+          <w:bCs/>
+          <w:sz w:val="28"/>
+          <w:szCs w:val="28"/>
+          <w:lang w:val="uk-UA"/>
+        </w:rPr>
+        <w:t>Етап №1</w:t>
+      </w:r>
+    </w:p>
+    <w:p>
+      <w:pPr>
+        <w:spacing w:after="0"/>
+        <w:rPr>
+          <w:sz w:val="28"/>
+          <w:szCs w:val="28"/>
+          <w:lang w:val="uk-UA"/>
+        </w:rPr>
+      </w:pPr>
+    </w:p>
+    <w:p>
+      <w:pPr>
+        <w:spacing w:after="0"/>
+        <w:rPr>
+          <w:sz w:val="28"/>
+          <w:szCs w:val="28"/>
+          <w:lang w:val="uk-UA"/>
+        </w:rPr>
+      </w:pPr>
+      <w:proofErr w:type="spellStart"/>
+      <w:r>
+        <w:rPr>
+          <w:sz w:val="28"/>
+          <w:szCs w:val="28"/>
+          <w:lang w:val="uk-UA"/>
+        </w:rPr>
+        <w:t>Перей</w:t>
+      </w:r>
+      <w:r>
+        <w:rPr>
+          <w:sz w:val="28"/>
+          <w:szCs w:val="28"/>
+          <w:lang w:val="en-US"/>
+        </w:rPr>
+        <w:t>ijd</w:t>
+      </w:r>
+      <w:proofErr w:type="spellEnd"/>
+      <w:r>
+        <w:rPr>
+          <w:sz w:val="28"/>
+          <w:szCs w:val="28"/>
+          <w:lang w:val="uk-UA"/>
+        </w:rPr>
+        <w:t xml:space="preserve"> у локальну папку </w:t>
+      </w:r>
+      <w:r>
+        <w:rPr>
+          <w:sz w:val="28"/>
+          <w:szCs w:val="28"/>
+          <w:lang w:val="uk-UA"/>
+        </w:rPr>
+        <w:t>та створив</w:t>
+      </w:r>
+      <w:r>
+        <w:rPr>
+          <w:sz w:val="28"/>
+          <w:szCs w:val="28"/>
+          <w:lang w:val="uk-UA"/>
+        </w:rPr>
+        <w:t xml:space="preserve"> новий </w:t>
+      </w:r>
+      <w:proofErr w:type="spellStart"/>
+      <w:r>
+        <w:rPr>
+          <w:sz w:val="28"/>
+          <w:szCs w:val="28"/>
+          <w:lang w:val="uk-UA"/>
+        </w:rPr>
+        <w:t>Vite</w:t>
+      </w:r>
+      <w:proofErr w:type="spellEnd"/>
+      <w:r>
+        <w:rPr>
+          <w:sz w:val="28"/>
+          <w:szCs w:val="28"/>
+          <w:lang w:val="uk-UA"/>
+        </w:rPr>
+        <w:t xml:space="preserve"> + </w:t>
+      </w:r>
+      <w:proofErr w:type="spellStart"/>
+      <w:r>
+        <w:rPr>
+          <w:sz w:val="28"/>
+          <w:szCs w:val="28"/>
+          <w:lang w:val="uk-UA"/>
+        </w:rPr>
+        <w:t>React</w:t>
+      </w:r>
+      <w:proofErr w:type="spellEnd"/>
+      <w:r>
+        <w:rPr>
+          <w:sz w:val="28"/>
+          <w:szCs w:val="28"/>
+          <w:lang w:val="uk-UA"/>
+        </w:rPr>
+        <w:t xml:space="preserve"> + </w:t>
+      </w:r>
+      <w:proofErr w:type="spellStart"/>
+      <w:r>
+        <w:rPr>
+          <w:sz w:val="28"/>
+          <w:szCs w:val="28"/>
+          <w:lang w:val="uk-UA"/>
+        </w:rPr>
+        <w:t>TypeScript</w:t>
+      </w:r>
+      <w:proofErr w:type="spellEnd"/>
       <w:r>
         <w:rPr>
           <w:sz w:val="28"/>
@@ -1669,16 +1855,3712 @@
         </w:rPr>
         <w:t xml:space="preserve"> </w:t>
       </w:r>
-    </w:p>
-    <w:p>
-      <w:pPr>
-        <w:spacing w:after="0"/>
-        <w:rPr>
-          <w:sz w:val="28"/>
-          <w:szCs w:val="28"/>
-          <w:lang w:val="uk-UA"/>
-        </w:rPr>
-      </w:pPr>
+      <w:proofErr w:type="spellStart"/>
+      <w:r>
+        <w:rPr>
+          <w:sz w:val="28"/>
+          <w:szCs w:val="28"/>
+          <w:lang w:val="uk-UA"/>
+        </w:rPr>
+        <w:t>проєкт</w:t>
+      </w:r>
+      <w:proofErr w:type="spellEnd"/>
+    </w:p>
+    <w:p>
+      <w:pPr>
+        <w:spacing w:after="0"/>
+        <w:rPr>
+          <w:sz w:val="28"/>
+          <w:szCs w:val="28"/>
+          <w:lang w:val="uk-UA"/>
+        </w:rPr>
+      </w:pPr>
+      <w:r>
+        <w:rPr>
+          <w:noProof/>
+        </w:rPr>
+        <w:drawing>
+          <wp:inline distT="0" distB="0" distL="0" distR="0" wp14:anchorId="3859AA8C" wp14:editId="7963208F">
+            <wp:extent cx="6645910" cy="3187700"/>
+            <wp:effectExtent l="0" t="0" r="2540" b="0"/>
+            <wp:docPr id="1" name="Рисунок 1"/>
+            <wp:cNvGraphicFramePr>
+              <a:graphicFrameLocks xmlns:a="http://schemas.openxmlformats.org/drawingml/2006/main" noChangeAspect="1"/>
+            </wp:cNvGraphicFramePr>
+            <a:graphic xmlns:a="http://schemas.openxmlformats.org/drawingml/2006/main">
+              <a:graphicData uri="http://schemas.openxmlformats.org/drawingml/2006/picture">
+                <pic:pic xmlns:pic="http://schemas.openxmlformats.org/drawingml/2006/picture">
+                  <pic:nvPicPr>
+                    <pic:cNvPr id="1" name=""/>
+                    <pic:cNvPicPr/>
+                  </pic:nvPicPr>
+                  <pic:blipFill>
+                    <a:blip r:embed="rId4"/>
+                    <a:stretch>
+                      <a:fillRect/>
+                    </a:stretch>
+                  </pic:blipFill>
+                  <pic:spPr>
+                    <a:xfrm>
+                      <a:off x="0" y="0"/>
+                      <a:ext cx="6645910" cy="3187700"/>
+                    </a:xfrm>
+                    <a:prstGeom prst="rect">
+                      <a:avLst/>
+                    </a:prstGeom>
+                  </pic:spPr>
+                </pic:pic>
+              </a:graphicData>
+            </a:graphic>
+          </wp:inline>
+        </w:drawing>
+      </w:r>
+    </w:p>
+    <w:p>
+      <w:pPr>
+        <w:spacing w:after="0"/>
+        <w:rPr>
+          <w:sz w:val="28"/>
+          <w:szCs w:val="28"/>
+          <w:lang w:val="uk-UA"/>
+        </w:rPr>
+      </w:pPr>
+      <w:r>
+        <w:rPr>
+          <w:sz w:val="28"/>
+          <w:szCs w:val="28"/>
+          <w:lang w:val="en-US"/>
+        </w:rPr>
+        <w:br/>
+      </w:r>
+      <w:proofErr w:type="spellStart"/>
+      <w:r>
+        <w:rPr>
+          <w:sz w:val="28"/>
+          <w:szCs w:val="28"/>
+        </w:rPr>
+        <w:t>Встановив</w:t>
+      </w:r>
+      <w:proofErr w:type="spellEnd"/>
+      <w:r>
+        <w:rPr>
+          <w:sz w:val="28"/>
+          <w:szCs w:val="28"/>
+          <w:lang w:val="uk-UA"/>
+        </w:rPr>
+        <w:t xml:space="preserve"> </w:t>
+      </w:r>
+      <w:proofErr w:type="spellStart"/>
+      <w:r>
+        <w:rPr>
+          <w:sz w:val="28"/>
+          <w:szCs w:val="28"/>
+          <w:lang w:val="uk-UA"/>
+        </w:rPr>
+        <w:t>TanStack</w:t>
+      </w:r>
+      <w:proofErr w:type="spellEnd"/>
+      <w:r>
+        <w:rPr>
+          <w:sz w:val="28"/>
+          <w:szCs w:val="28"/>
+          <w:lang w:val="uk-UA"/>
+        </w:rPr>
+        <w:t xml:space="preserve"> </w:t>
+      </w:r>
+      <w:proofErr w:type="spellStart"/>
+      <w:r>
+        <w:rPr>
+          <w:sz w:val="28"/>
+          <w:szCs w:val="28"/>
+          <w:lang w:val="uk-UA"/>
+        </w:rPr>
+        <w:t>Query</w:t>
+      </w:r>
+      <w:proofErr w:type="spellEnd"/>
+      <w:r>
+        <w:rPr>
+          <w:sz w:val="28"/>
+          <w:szCs w:val="28"/>
+          <w:lang w:val="uk-UA"/>
+        </w:rPr>
+        <w:t xml:space="preserve"> (@tanstack/react-query)</w:t>
+      </w:r>
+      <w:r>
+        <w:rPr>
+          <w:sz w:val="28"/>
+          <w:szCs w:val="28"/>
+          <w:lang w:val="uk-UA"/>
+        </w:rPr>
+        <w:t>:</w:t>
+      </w:r>
+    </w:p>
+    <w:p>
+      <w:pPr>
+        <w:spacing w:after="0"/>
+        <w:rPr>
+          <w:sz w:val="28"/>
+          <w:szCs w:val="28"/>
+        </w:rPr>
+      </w:pPr>
+      <w:r>
+        <w:rPr>
+          <w:noProof/>
+        </w:rPr>
+        <w:drawing>
+          <wp:inline distT="0" distB="0" distL="0" distR="0" wp14:anchorId="0FD38CB5" wp14:editId="0D50430A">
+            <wp:extent cx="6645910" cy="2442845"/>
+            <wp:effectExtent l="0" t="0" r="2540" b="0"/>
+            <wp:docPr id="2" name="Рисунок 2"/>
+            <wp:cNvGraphicFramePr>
+              <a:graphicFrameLocks xmlns:a="http://schemas.openxmlformats.org/drawingml/2006/main" noChangeAspect="1"/>
+            </wp:cNvGraphicFramePr>
+            <a:graphic xmlns:a="http://schemas.openxmlformats.org/drawingml/2006/main">
+              <a:graphicData uri="http://schemas.openxmlformats.org/drawingml/2006/picture">
+                <pic:pic xmlns:pic="http://schemas.openxmlformats.org/drawingml/2006/picture">
+                  <pic:nvPicPr>
+                    <pic:cNvPr id="1" name=""/>
+                    <pic:cNvPicPr/>
+                  </pic:nvPicPr>
+                  <pic:blipFill>
+                    <a:blip r:embed="rId5"/>
+                    <a:stretch>
+                      <a:fillRect/>
+                    </a:stretch>
+                  </pic:blipFill>
+                  <pic:spPr>
+                    <a:xfrm>
+                      <a:off x="0" y="0"/>
+                      <a:ext cx="6645910" cy="2442845"/>
+                    </a:xfrm>
+                    <a:prstGeom prst="rect">
+                      <a:avLst/>
+                    </a:prstGeom>
+                  </pic:spPr>
+                </pic:pic>
+              </a:graphicData>
+            </a:graphic>
+          </wp:inline>
+        </w:drawing>
+      </w:r>
+    </w:p>
+    <w:p>
+      <w:pPr>
+        <w:spacing w:after="0"/>
+        <w:rPr>
+          <w:sz w:val="28"/>
+          <w:szCs w:val="28"/>
+        </w:rPr>
+      </w:pPr>
+    </w:p>
+    <w:p>
+      <w:pPr>
+        <w:spacing w:after="0"/>
+        <w:rPr>
+          <w:sz w:val="28"/>
+          <w:szCs w:val="28"/>
+          <w:lang w:val="uk-UA"/>
+        </w:rPr>
+      </w:pPr>
+      <w:r>
+        <w:rPr>
+          <w:sz w:val="28"/>
+          <w:szCs w:val="28"/>
+          <w:lang w:val="uk-UA"/>
+        </w:rPr>
+        <w:t xml:space="preserve">Підключив </w:t>
+      </w:r>
+      <w:proofErr w:type="spellStart"/>
+      <w:r>
+        <w:rPr>
+          <w:sz w:val="28"/>
+          <w:szCs w:val="28"/>
+          <w:lang w:val="uk-UA"/>
+        </w:rPr>
+        <w:t>QueryClientProvider</w:t>
+      </w:r>
+      <w:proofErr w:type="spellEnd"/>
+      <w:r>
+        <w:rPr>
+          <w:sz w:val="28"/>
+          <w:szCs w:val="28"/>
+          <w:lang w:val="uk-UA"/>
+        </w:rPr>
+        <w:t xml:space="preserve"> у </w:t>
+      </w:r>
+      <w:proofErr w:type="spellStart"/>
+      <w:r>
+        <w:rPr>
+          <w:sz w:val="28"/>
+          <w:szCs w:val="28"/>
+          <w:lang w:val="uk-UA"/>
+        </w:rPr>
+        <w:t>src</w:t>
+      </w:r>
+      <w:proofErr w:type="spellEnd"/>
+      <w:r>
+        <w:rPr>
+          <w:sz w:val="28"/>
+          <w:szCs w:val="28"/>
+          <w:lang w:val="uk-UA"/>
+        </w:rPr>
+        <w:t>/</w:t>
+      </w:r>
+      <w:proofErr w:type="spellStart"/>
+      <w:r>
+        <w:rPr>
+          <w:sz w:val="28"/>
+          <w:szCs w:val="28"/>
+          <w:lang w:val="uk-UA"/>
+        </w:rPr>
+        <w:t>main.tsx</w:t>
+      </w:r>
+      <w:proofErr w:type="spellEnd"/>
+      <w:r>
+        <w:rPr>
+          <w:sz w:val="28"/>
+          <w:szCs w:val="28"/>
+          <w:lang w:val="uk-UA"/>
+        </w:rPr>
+        <w:t>:</w:t>
+      </w:r>
+    </w:p>
+    <w:p>
+      <w:pPr>
+        <w:shd w:val="clear" w:color="auto" w:fill="1F1F1F"/>
+        <w:spacing w:after="0" w:line="285" w:lineRule="atLeast"/>
+        <w:rPr>
+          <w:rFonts w:ascii="Consolas" w:eastAsia="Times New Roman" w:hAnsi="Consolas" w:cs="Times New Roman"/>
+          <w:color w:val="CCCCCC"/>
+          <w:sz w:val="21"/>
+          <w:szCs w:val="21"/>
+          <w:lang w:val="en-US" w:eastAsia="ru-RU"/>
+        </w:rPr>
+      </w:pPr>
+      <w:r>
+        <w:rPr>
+          <w:rFonts w:ascii="Consolas" w:eastAsia="Times New Roman" w:hAnsi="Consolas" w:cs="Times New Roman"/>
+          <w:color w:val="C586C0"/>
+          <w:sz w:val="21"/>
+          <w:szCs w:val="21"/>
+          <w:lang w:val="en-US" w:eastAsia="ru-RU"/>
+        </w:rPr>
+        <w:t>import</w:t>
+      </w:r>
+      <w:r>
+        <w:rPr>
+          <w:rFonts w:ascii="Consolas" w:eastAsia="Times New Roman" w:hAnsi="Consolas" w:cs="Times New Roman"/>
+          <w:color w:val="CCCCCC"/>
+          <w:sz w:val="21"/>
+          <w:szCs w:val="21"/>
+          <w:lang w:val="en-US" w:eastAsia="ru-RU"/>
+        </w:rPr>
+        <w:t xml:space="preserve"> { </w:t>
+      </w:r>
+      <w:proofErr w:type="spellStart"/>
+      <w:r>
+        <w:rPr>
+          <w:rFonts w:ascii="Consolas" w:eastAsia="Times New Roman" w:hAnsi="Consolas" w:cs="Times New Roman"/>
+          <w:color w:val="9CDCFE"/>
+          <w:sz w:val="21"/>
+          <w:szCs w:val="21"/>
+          <w:lang w:val="en-US" w:eastAsia="ru-RU"/>
+        </w:rPr>
+        <w:t>StrictMode</w:t>
+      </w:r>
+      <w:proofErr w:type="spellEnd"/>
+      <w:r>
+        <w:rPr>
+          <w:rFonts w:ascii="Consolas" w:eastAsia="Times New Roman" w:hAnsi="Consolas" w:cs="Times New Roman"/>
+          <w:color w:val="CCCCCC"/>
+          <w:sz w:val="21"/>
+          <w:szCs w:val="21"/>
+          <w:lang w:val="en-US" w:eastAsia="ru-RU"/>
+        </w:rPr>
+        <w:t xml:space="preserve"> } </w:t>
+      </w:r>
+      <w:r>
+        <w:rPr>
+          <w:rFonts w:ascii="Consolas" w:eastAsia="Times New Roman" w:hAnsi="Consolas" w:cs="Times New Roman"/>
+          <w:color w:val="C586C0"/>
+          <w:sz w:val="21"/>
+          <w:szCs w:val="21"/>
+          <w:lang w:val="en-US" w:eastAsia="ru-RU"/>
+        </w:rPr>
+        <w:t>from</w:t>
+      </w:r>
+      <w:r>
+        <w:rPr>
+          <w:rFonts w:ascii="Consolas" w:eastAsia="Times New Roman" w:hAnsi="Consolas" w:cs="Times New Roman"/>
+          <w:color w:val="CCCCCC"/>
+          <w:sz w:val="21"/>
+          <w:szCs w:val="21"/>
+          <w:lang w:val="en-US" w:eastAsia="ru-RU"/>
+        </w:rPr>
+        <w:t xml:space="preserve"> </w:t>
+      </w:r>
+      <w:r>
+        <w:rPr>
+          <w:rFonts w:ascii="Consolas" w:eastAsia="Times New Roman" w:hAnsi="Consolas" w:cs="Times New Roman"/>
+          <w:color w:val="CE9178"/>
+          <w:sz w:val="21"/>
+          <w:szCs w:val="21"/>
+          <w:lang w:val="en-US" w:eastAsia="ru-RU"/>
+        </w:rPr>
+        <w:t>'react'</w:t>
+      </w:r>
+    </w:p>
+    <w:p>
+      <w:pPr>
+        <w:shd w:val="clear" w:color="auto" w:fill="1F1F1F"/>
+        <w:spacing w:after="0" w:line="285" w:lineRule="atLeast"/>
+        <w:rPr>
+          <w:rFonts w:ascii="Consolas" w:eastAsia="Times New Roman" w:hAnsi="Consolas" w:cs="Times New Roman"/>
+          <w:color w:val="CCCCCC"/>
+          <w:sz w:val="21"/>
+          <w:szCs w:val="21"/>
+          <w:lang w:val="en-US" w:eastAsia="ru-RU"/>
+        </w:rPr>
+      </w:pPr>
+      <w:r>
+        <w:rPr>
+          <w:rFonts w:ascii="Consolas" w:eastAsia="Times New Roman" w:hAnsi="Consolas" w:cs="Times New Roman"/>
+          <w:color w:val="C586C0"/>
+          <w:sz w:val="21"/>
+          <w:szCs w:val="21"/>
+          <w:lang w:val="en-US" w:eastAsia="ru-RU"/>
+        </w:rPr>
+        <w:t>import</w:t>
+      </w:r>
+      <w:r>
+        <w:rPr>
+          <w:rFonts w:ascii="Consolas" w:eastAsia="Times New Roman" w:hAnsi="Consolas" w:cs="Times New Roman"/>
+          <w:color w:val="CCCCCC"/>
+          <w:sz w:val="21"/>
+          <w:szCs w:val="21"/>
+          <w:lang w:val="en-US" w:eastAsia="ru-RU"/>
+        </w:rPr>
+        <w:t xml:space="preserve"> { </w:t>
+      </w:r>
+      <w:proofErr w:type="spellStart"/>
+      <w:r>
+        <w:rPr>
+          <w:rFonts w:ascii="Consolas" w:eastAsia="Times New Roman" w:hAnsi="Consolas" w:cs="Times New Roman"/>
+          <w:color w:val="9CDCFE"/>
+          <w:sz w:val="21"/>
+          <w:szCs w:val="21"/>
+          <w:lang w:val="en-US" w:eastAsia="ru-RU"/>
+        </w:rPr>
+        <w:t>createRoot</w:t>
+      </w:r>
+      <w:proofErr w:type="spellEnd"/>
+      <w:r>
+        <w:rPr>
+          <w:rFonts w:ascii="Consolas" w:eastAsia="Times New Roman" w:hAnsi="Consolas" w:cs="Times New Roman"/>
+          <w:color w:val="CCCCCC"/>
+          <w:sz w:val="21"/>
+          <w:szCs w:val="21"/>
+          <w:lang w:val="en-US" w:eastAsia="ru-RU"/>
+        </w:rPr>
+        <w:t xml:space="preserve"> } </w:t>
+      </w:r>
+      <w:r>
+        <w:rPr>
+          <w:rFonts w:ascii="Consolas" w:eastAsia="Times New Roman" w:hAnsi="Consolas" w:cs="Times New Roman"/>
+          <w:color w:val="C586C0"/>
+          <w:sz w:val="21"/>
+          <w:szCs w:val="21"/>
+          <w:lang w:val="en-US" w:eastAsia="ru-RU"/>
+        </w:rPr>
+        <w:t>from</w:t>
+      </w:r>
+      <w:r>
+        <w:rPr>
+          <w:rFonts w:ascii="Consolas" w:eastAsia="Times New Roman" w:hAnsi="Consolas" w:cs="Times New Roman"/>
+          <w:color w:val="CCCCCC"/>
+          <w:sz w:val="21"/>
+          <w:szCs w:val="21"/>
+          <w:lang w:val="en-US" w:eastAsia="ru-RU"/>
+        </w:rPr>
+        <w:t xml:space="preserve"> </w:t>
+      </w:r>
+      <w:r>
+        <w:rPr>
+          <w:rFonts w:ascii="Consolas" w:eastAsia="Times New Roman" w:hAnsi="Consolas" w:cs="Times New Roman"/>
+          <w:color w:val="CE9178"/>
+          <w:sz w:val="21"/>
+          <w:szCs w:val="21"/>
+          <w:lang w:val="en-US" w:eastAsia="ru-RU"/>
+        </w:rPr>
+        <w:t>'react-</w:t>
+      </w:r>
+      <w:proofErr w:type="spellStart"/>
+      <w:r>
+        <w:rPr>
+          <w:rFonts w:ascii="Consolas" w:eastAsia="Times New Roman" w:hAnsi="Consolas" w:cs="Times New Roman"/>
+          <w:color w:val="CE9178"/>
+          <w:sz w:val="21"/>
+          <w:szCs w:val="21"/>
+          <w:lang w:val="en-US" w:eastAsia="ru-RU"/>
+        </w:rPr>
+        <w:t>dom</w:t>
+      </w:r>
+      <w:proofErr w:type="spellEnd"/>
+      <w:r>
+        <w:rPr>
+          <w:rFonts w:ascii="Consolas" w:eastAsia="Times New Roman" w:hAnsi="Consolas" w:cs="Times New Roman"/>
+          <w:color w:val="CE9178"/>
+          <w:sz w:val="21"/>
+          <w:szCs w:val="21"/>
+          <w:lang w:val="en-US" w:eastAsia="ru-RU"/>
+        </w:rPr>
+        <w:t>/client'</w:t>
+      </w:r>
+    </w:p>
+    <w:p>
+      <w:pPr>
+        <w:shd w:val="clear" w:color="auto" w:fill="1F1F1F"/>
+        <w:spacing w:after="0" w:line="285" w:lineRule="atLeast"/>
+        <w:rPr>
+          <w:rFonts w:ascii="Consolas" w:eastAsia="Times New Roman" w:hAnsi="Consolas" w:cs="Times New Roman"/>
+          <w:color w:val="CCCCCC"/>
+          <w:sz w:val="21"/>
+          <w:szCs w:val="21"/>
+          <w:lang w:val="en-US" w:eastAsia="ru-RU"/>
+        </w:rPr>
+      </w:pPr>
+      <w:r>
+        <w:rPr>
+          <w:rFonts w:ascii="Consolas" w:eastAsia="Times New Roman" w:hAnsi="Consolas" w:cs="Times New Roman"/>
+          <w:color w:val="C586C0"/>
+          <w:sz w:val="21"/>
+          <w:szCs w:val="21"/>
+          <w:lang w:val="en-US" w:eastAsia="ru-RU"/>
+        </w:rPr>
+        <w:t>import</w:t>
+      </w:r>
+      <w:r>
+        <w:rPr>
+          <w:rFonts w:ascii="Consolas" w:eastAsia="Times New Roman" w:hAnsi="Consolas" w:cs="Times New Roman"/>
+          <w:color w:val="CCCCCC"/>
+          <w:sz w:val="21"/>
+          <w:szCs w:val="21"/>
+          <w:lang w:val="en-US" w:eastAsia="ru-RU"/>
+        </w:rPr>
+        <w:t xml:space="preserve"> </w:t>
+      </w:r>
+      <w:r>
+        <w:rPr>
+          <w:rFonts w:ascii="Consolas" w:eastAsia="Times New Roman" w:hAnsi="Consolas" w:cs="Times New Roman"/>
+          <w:color w:val="CE9178"/>
+          <w:sz w:val="21"/>
+          <w:szCs w:val="21"/>
+          <w:lang w:val="en-US" w:eastAsia="ru-RU"/>
+        </w:rPr>
+        <w:t>'./index.css'</w:t>
+      </w:r>
+    </w:p>
+    <w:p>
+      <w:pPr>
+        <w:shd w:val="clear" w:color="auto" w:fill="1F1F1F"/>
+        <w:spacing w:after="0" w:line="285" w:lineRule="atLeast"/>
+        <w:rPr>
+          <w:rFonts w:ascii="Consolas" w:eastAsia="Times New Roman" w:hAnsi="Consolas" w:cs="Times New Roman"/>
+          <w:color w:val="CCCCCC"/>
+          <w:sz w:val="21"/>
+          <w:szCs w:val="21"/>
+          <w:lang w:val="en-US" w:eastAsia="ru-RU"/>
+        </w:rPr>
+      </w:pPr>
+      <w:r>
+        <w:rPr>
+          <w:rFonts w:ascii="Consolas" w:eastAsia="Times New Roman" w:hAnsi="Consolas" w:cs="Times New Roman"/>
+          <w:color w:val="C586C0"/>
+          <w:sz w:val="21"/>
+          <w:szCs w:val="21"/>
+          <w:lang w:val="en-US" w:eastAsia="ru-RU"/>
+        </w:rPr>
+        <w:t>import</w:t>
+      </w:r>
+      <w:r>
+        <w:rPr>
+          <w:rFonts w:ascii="Consolas" w:eastAsia="Times New Roman" w:hAnsi="Consolas" w:cs="Times New Roman"/>
+          <w:color w:val="CCCCCC"/>
+          <w:sz w:val="21"/>
+          <w:szCs w:val="21"/>
+          <w:lang w:val="en-US" w:eastAsia="ru-RU"/>
+        </w:rPr>
+        <w:t xml:space="preserve"> </w:t>
+      </w:r>
+      <w:r>
+        <w:rPr>
+          <w:rFonts w:ascii="Consolas" w:eastAsia="Times New Roman" w:hAnsi="Consolas" w:cs="Times New Roman"/>
+          <w:color w:val="9CDCFE"/>
+          <w:sz w:val="21"/>
+          <w:szCs w:val="21"/>
+          <w:lang w:val="en-US" w:eastAsia="ru-RU"/>
+        </w:rPr>
+        <w:t>App</w:t>
+      </w:r>
+      <w:r>
+        <w:rPr>
+          <w:rFonts w:ascii="Consolas" w:eastAsia="Times New Roman" w:hAnsi="Consolas" w:cs="Times New Roman"/>
+          <w:color w:val="CCCCCC"/>
+          <w:sz w:val="21"/>
+          <w:szCs w:val="21"/>
+          <w:lang w:val="en-US" w:eastAsia="ru-RU"/>
+        </w:rPr>
+        <w:t xml:space="preserve"> </w:t>
+      </w:r>
+      <w:r>
+        <w:rPr>
+          <w:rFonts w:ascii="Consolas" w:eastAsia="Times New Roman" w:hAnsi="Consolas" w:cs="Times New Roman"/>
+          <w:color w:val="C586C0"/>
+          <w:sz w:val="21"/>
+          <w:szCs w:val="21"/>
+          <w:lang w:val="en-US" w:eastAsia="ru-RU"/>
+        </w:rPr>
+        <w:t>from</w:t>
+      </w:r>
+      <w:r>
+        <w:rPr>
+          <w:rFonts w:ascii="Consolas" w:eastAsia="Times New Roman" w:hAnsi="Consolas" w:cs="Times New Roman"/>
+          <w:color w:val="CCCCCC"/>
+          <w:sz w:val="21"/>
+          <w:szCs w:val="21"/>
+          <w:lang w:val="en-US" w:eastAsia="ru-RU"/>
+        </w:rPr>
+        <w:t xml:space="preserve"> </w:t>
+      </w:r>
+      <w:r>
+        <w:rPr>
+          <w:rFonts w:ascii="Consolas" w:eastAsia="Times New Roman" w:hAnsi="Consolas" w:cs="Times New Roman"/>
+          <w:color w:val="CE9178"/>
+          <w:sz w:val="21"/>
+          <w:szCs w:val="21"/>
+          <w:lang w:val="en-US" w:eastAsia="ru-RU"/>
+        </w:rPr>
+        <w:t>'./</w:t>
+      </w:r>
+      <w:proofErr w:type="spellStart"/>
+      <w:r>
+        <w:rPr>
+          <w:rFonts w:ascii="Consolas" w:eastAsia="Times New Roman" w:hAnsi="Consolas" w:cs="Times New Roman"/>
+          <w:color w:val="CE9178"/>
+          <w:sz w:val="21"/>
+          <w:szCs w:val="21"/>
+          <w:lang w:val="en-US" w:eastAsia="ru-RU"/>
+        </w:rPr>
+        <w:t>App.tsx</w:t>
+      </w:r>
+      <w:proofErr w:type="spellEnd"/>
+      <w:r>
+        <w:rPr>
+          <w:rFonts w:ascii="Consolas" w:eastAsia="Times New Roman" w:hAnsi="Consolas" w:cs="Times New Roman"/>
+          <w:color w:val="CE9178"/>
+          <w:sz w:val="21"/>
+          <w:szCs w:val="21"/>
+          <w:lang w:val="en-US" w:eastAsia="ru-RU"/>
+        </w:rPr>
+        <w:t>'</w:t>
+      </w:r>
+    </w:p>
+    <w:p>
+      <w:pPr>
+        <w:shd w:val="clear" w:color="auto" w:fill="1F1F1F"/>
+        <w:spacing w:after="0" w:line="285" w:lineRule="atLeast"/>
+        <w:rPr>
+          <w:rFonts w:ascii="Consolas" w:eastAsia="Times New Roman" w:hAnsi="Consolas" w:cs="Times New Roman"/>
+          <w:color w:val="CCCCCC"/>
+          <w:sz w:val="21"/>
+          <w:szCs w:val="21"/>
+          <w:lang w:val="en-US" w:eastAsia="ru-RU"/>
+        </w:rPr>
+      </w:pPr>
+      <w:r>
+        <w:rPr>
+          <w:rFonts w:ascii="Consolas" w:eastAsia="Times New Roman" w:hAnsi="Consolas" w:cs="Times New Roman"/>
+          <w:color w:val="C586C0"/>
+          <w:sz w:val="21"/>
+          <w:szCs w:val="21"/>
+          <w:lang w:val="en-US" w:eastAsia="ru-RU"/>
+        </w:rPr>
+        <w:t>import</w:t>
+      </w:r>
+      <w:r>
+        <w:rPr>
+          <w:rFonts w:ascii="Consolas" w:eastAsia="Times New Roman" w:hAnsi="Consolas" w:cs="Times New Roman"/>
+          <w:color w:val="CCCCCC"/>
+          <w:sz w:val="21"/>
+          <w:szCs w:val="21"/>
+          <w:lang w:val="en-US" w:eastAsia="ru-RU"/>
+        </w:rPr>
+        <w:t xml:space="preserve"> { </w:t>
+      </w:r>
+      <w:proofErr w:type="spellStart"/>
+      <w:r>
+        <w:rPr>
+          <w:rFonts w:ascii="Consolas" w:eastAsia="Times New Roman" w:hAnsi="Consolas" w:cs="Times New Roman"/>
+          <w:color w:val="9CDCFE"/>
+          <w:sz w:val="21"/>
+          <w:szCs w:val="21"/>
+          <w:lang w:val="en-US" w:eastAsia="ru-RU"/>
+        </w:rPr>
+        <w:t>QueryClient</w:t>
+      </w:r>
+      <w:proofErr w:type="spellEnd"/>
+      <w:r>
+        <w:rPr>
+          <w:rFonts w:ascii="Consolas" w:eastAsia="Times New Roman" w:hAnsi="Consolas" w:cs="Times New Roman"/>
+          <w:color w:val="CCCCCC"/>
+          <w:sz w:val="21"/>
+          <w:szCs w:val="21"/>
+          <w:lang w:val="en-US" w:eastAsia="ru-RU"/>
+        </w:rPr>
+        <w:t xml:space="preserve">, </w:t>
+      </w:r>
+      <w:proofErr w:type="spellStart"/>
+      <w:r>
+        <w:rPr>
+          <w:rFonts w:ascii="Consolas" w:eastAsia="Times New Roman" w:hAnsi="Consolas" w:cs="Times New Roman"/>
+          <w:color w:val="9CDCFE"/>
+          <w:sz w:val="21"/>
+          <w:szCs w:val="21"/>
+          <w:lang w:val="en-US" w:eastAsia="ru-RU"/>
+        </w:rPr>
+        <w:t>QueryClientProvider</w:t>
+      </w:r>
+      <w:proofErr w:type="spellEnd"/>
+      <w:r>
+        <w:rPr>
+          <w:rFonts w:ascii="Consolas" w:eastAsia="Times New Roman" w:hAnsi="Consolas" w:cs="Times New Roman"/>
+          <w:color w:val="CCCCCC"/>
+          <w:sz w:val="21"/>
+          <w:szCs w:val="21"/>
+          <w:lang w:val="en-US" w:eastAsia="ru-RU"/>
+        </w:rPr>
+        <w:t xml:space="preserve"> } </w:t>
+      </w:r>
+      <w:r>
+        <w:rPr>
+          <w:rFonts w:ascii="Consolas" w:eastAsia="Times New Roman" w:hAnsi="Consolas" w:cs="Times New Roman"/>
+          <w:color w:val="C586C0"/>
+          <w:sz w:val="21"/>
+          <w:szCs w:val="21"/>
+          <w:lang w:val="en-US" w:eastAsia="ru-RU"/>
+        </w:rPr>
+        <w:t>from</w:t>
+      </w:r>
+      <w:r>
+        <w:rPr>
+          <w:rFonts w:ascii="Consolas" w:eastAsia="Times New Roman" w:hAnsi="Consolas" w:cs="Times New Roman"/>
+          <w:color w:val="CCCCCC"/>
+          <w:sz w:val="21"/>
+          <w:szCs w:val="21"/>
+          <w:lang w:val="en-US" w:eastAsia="ru-RU"/>
+        </w:rPr>
+        <w:t xml:space="preserve"> </w:t>
+      </w:r>
+      <w:r>
+        <w:rPr>
+          <w:rFonts w:ascii="Consolas" w:eastAsia="Times New Roman" w:hAnsi="Consolas" w:cs="Times New Roman"/>
+          <w:color w:val="CE9178"/>
+          <w:sz w:val="21"/>
+          <w:szCs w:val="21"/>
+          <w:lang w:val="en-US" w:eastAsia="ru-RU"/>
+        </w:rPr>
+        <w:t>'@</w:t>
+      </w:r>
+      <w:proofErr w:type="spellStart"/>
+      <w:r>
+        <w:rPr>
+          <w:rFonts w:ascii="Consolas" w:eastAsia="Times New Roman" w:hAnsi="Consolas" w:cs="Times New Roman"/>
+          <w:color w:val="CE9178"/>
+          <w:sz w:val="21"/>
+          <w:szCs w:val="21"/>
+          <w:lang w:val="en-US" w:eastAsia="ru-RU"/>
+        </w:rPr>
+        <w:t>tanstack</w:t>
+      </w:r>
+      <w:proofErr w:type="spellEnd"/>
+      <w:r>
+        <w:rPr>
+          <w:rFonts w:ascii="Consolas" w:eastAsia="Times New Roman" w:hAnsi="Consolas" w:cs="Times New Roman"/>
+          <w:color w:val="CE9178"/>
+          <w:sz w:val="21"/>
+          <w:szCs w:val="21"/>
+          <w:lang w:val="en-US" w:eastAsia="ru-RU"/>
+        </w:rPr>
+        <w:t>/react-query'</w:t>
+      </w:r>
+    </w:p>
+    <w:p>
+      <w:pPr>
+        <w:shd w:val="clear" w:color="auto" w:fill="1F1F1F"/>
+        <w:spacing w:after="0" w:line="285" w:lineRule="atLeast"/>
+        <w:rPr>
+          <w:rFonts w:ascii="Consolas" w:eastAsia="Times New Roman" w:hAnsi="Consolas" w:cs="Times New Roman"/>
+          <w:color w:val="CCCCCC"/>
+          <w:sz w:val="21"/>
+          <w:szCs w:val="21"/>
+          <w:lang w:val="en-US" w:eastAsia="ru-RU"/>
+        </w:rPr>
+      </w:pPr>
+    </w:p>
+    <w:p>
+      <w:pPr>
+        <w:shd w:val="clear" w:color="auto" w:fill="1F1F1F"/>
+        <w:spacing w:after="0" w:line="285" w:lineRule="atLeast"/>
+        <w:rPr>
+          <w:rFonts w:ascii="Consolas" w:eastAsia="Times New Roman" w:hAnsi="Consolas" w:cs="Times New Roman"/>
+          <w:color w:val="CCCCCC"/>
+          <w:sz w:val="21"/>
+          <w:szCs w:val="21"/>
+          <w:lang w:val="en-US" w:eastAsia="ru-RU"/>
+        </w:rPr>
+      </w:pPr>
+      <w:r>
+        <w:rPr>
+          <w:rFonts w:ascii="Consolas" w:eastAsia="Times New Roman" w:hAnsi="Consolas" w:cs="Times New Roman"/>
+          <w:color w:val="569CD6"/>
+          <w:sz w:val="21"/>
+          <w:szCs w:val="21"/>
+          <w:lang w:val="en-US" w:eastAsia="ru-RU"/>
+        </w:rPr>
+        <w:t>const</w:t>
+      </w:r>
+      <w:r>
+        <w:rPr>
+          <w:rFonts w:ascii="Consolas" w:eastAsia="Times New Roman" w:hAnsi="Consolas" w:cs="Times New Roman"/>
+          <w:color w:val="CCCCCC"/>
+          <w:sz w:val="21"/>
+          <w:szCs w:val="21"/>
+          <w:lang w:val="en-US" w:eastAsia="ru-RU"/>
+        </w:rPr>
+        <w:t xml:space="preserve"> </w:t>
+      </w:r>
+      <w:proofErr w:type="spellStart"/>
+      <w:r>
+        <w:rPr>
+          <w:rFonts w:ascii="Consolas" w:eastAsia="Times New Roman" w:hAnsi="Consolas" w:cs="Times New Roman"/>
+          <w:color w:val="4FC1FF"/>
+          <w:sz w:val="21"/>
+          <w:szCs w:val="21"/>
+          <w:lang w:val="en-US" w:eastAsia="ru-RU"/>
+        </w:rPr>
+        <w:t>queryClient</w:t>
+      </w:r>
+      <w:proofErr w:type="spellEnd"/>
+      <w:r>
+        <w:rPr>
+          <w:rFonts w:ascii="Consolas" w:eastAsia="Times New Roman" w:hAnsi="Consolas" w:cs="Times New Roman"/>
+          <w:color w:val="CCCCCC"/>
+          <w:sz w:val="21"/>
+          <w:szCs w:val="21"/>
+          <w:lang w:val="en-US" w:eastAsia="ru-RU"/>
+        </w:rPr>
+        <w:t xml:space="preserve"> </w:t>
+      </w:r>
+      <w:r>
+        <w:rPr>
+          <w:rFonts w:ascii="Consolas" w:eastAsia="Times New Roman" w:hAnsi="Consolas" w:cs="Times New Roman"/>
+          <w:color w:val="D4D4D4"/>
+          <w:sz w:val="21"/>
+          <w:szCs w:val="21"/>
+          <w:lang w:val="en-US" w:eastAsia="ru-RU"/>
+        </w:rPr>
+        <w:t>=</w:t>
+      </w:r>
+      <w:r>
+        <w:rPr>
+          <w:rFonts w:ascii="Consolas" w:eastAsia="Times New Roman" w:hAnsi="Consolas" w:cs="Times New Roman"/>
+          <w:color w:val="CCCCCC"/>
+          <w:sz w:val="21"/>
+          <w:szCs w:val="21"/>
+          <w:lang w:val="en-US" w:eastAsia="ru-RU"/>
+        </w:rPr>
+        <w:t xml:space="preserve"> </w:t>
+      </w:r>
+      <w:r>
+        <w:rPr>
+          <w:rFonts w:ascii="Consolas" w:eastAsia="Times New Roman" w:hAnsi="Consolas" w:cs="Times New Roman"/>
+          <w:color w:val="569CD6"/>
+          <w:sz w:val="21"/>
+          <w:szCs w:val="21"/>
+          <w:lang w:val="en-US" w:eastAsia="ru-RU"/>
+        </w:rPr>
+        <w:t>new</w:t>
+      </w:r>
+      <w:r>
+        <w:rPr>
+          <w:rFonts w:ascii="Consolas" w:eastAsia="Times New Roman" w:hAnsi="Consolas" w:cs="Times New Roman"/>
+          <w:color w:val="CCCCCC"/>
+          <w:sz w:val="21"/>
+          <w:szCs w:val="21"/>
+          <w:lang w:val="en-US" w:eastAsia="ru-RU"/>
+        </w:rPr>
+        <w:t xml:space="preserve"> </w:t>
+      </w:r>
+      <w:proofErr w:type="spellStart"/>
+      <w:r>
+        <w:rPr>
+          <w:rFonts w:ascii="Consolas" w:eastAsia="Times New Roman" w:hAnsi="Consolas" w:cs="Times New Roman"/>
+          <w:color w:val="4EC9B0"/>
+          <w:sz w:val="21"/>
+          <w:szCs w:val="21"/>
+          <w:lang w:val="en-US" w:eastAsia="ru-RU"/>
+        </w:rPr>
+        <w:t>QueryClient</w:t>
+      </w:r>
+      <w:proofErr w:type="spellEnd"/>
+      <w:r>
+        <w:rPr>
+          <w:rFonts w:ascii="Consolas" w:eastAsia="Times New Roman" w:hAnsi="Consolas" w:cs="Times New Roman"/>
+          <w:color w:val="CCCCCC"/>
+          <w:sz w:val="21"/>
+          <w:szCs w:val="21"/>
+          <w:lang w:val="en-US" w:eastAsia="ru-RU"/>
+        </w:rPr>
+        <w:t>()</w:t>
+      </w:r>
+    </w:p>
+    <w:p>
+      <w:pPr>
+        <w:shd w:val="clear" w:color="auto" w:fill="1F1F1F"/>
+        <w:spacing w:after="0" w:line="285" w:lineRule="atLeast"/>
+        <w:rPr>
+          <w:rFonts w:ascii="Consolas" w:eastAsia="Times New Roman" w:hAnsi="Consolas" w:cs="Times New Roman"/>
+          <w:color w:val="CCCCCC"/>
+          <w:sz w:val="21"/>
+          <w:szCs w:val="21"/>
+          <w:lang w:val="en-US" w:eastAsia="ru-RU"/>
+        </w:rPr>
+      </w:pPr>
+    </w:p>
+    <w:p>
+      <w:pPr>
+        <w:shd w:val="clear" w:color="auto" w:fill="1F1F1F"/>
+        <w:spacing w:after="0" w:line="285" w:lineRule="atLeast"/>
+        <w:rPr>
+          <w:rFonts w:ascii="Consolas" w:eastAsia="Times New Roman" w:hAnsi="Consolas" w:cs="Times New Roman"/>
+          <w:color w:val="CCCCCC"/>
+          <w:sz w:val="21"/>
+          <w:szCs w:val="21"/>
+          <w:lang w:val="en-US" w:eastAsia="ru-RU"/>
+        </w:rPr>
+      </w:pPr>
+      <w:proofErr w:type="spellStart"/>
+      <w:r>
+        <w:rPr>
+          <w:rFonts w:ascii="Consolas" w:eastAsia="Times New Roman" w:hAnsi="Consolas" w:cs="Times New Roman"/>
+          <w:color w:val="DCDCAA"/>
+          <w:sz w:val="21"/>
+          <w:szCs w:val="21"/>
+          <w:lang w:val="en-US" w:eastAsia="ru-RU"/>
+        </w:rPr>
+        <w:t>createRoot</w:t>
+      </w:r>
+      <w:proofErr w:type="spellEnd"/>
+      <w:r>
+        <w:rPr>
+          <w:rFonts w:ascii="Consolas" w:eastAsia="Times New Roman" w:hAnsi="Consolas" w:cs="Times New Roman"/>
+          <w:color w:val="CCCCCC"/>
+          <w:sz w:val="21"/>
+          <w:szCs w:val="21"/>
+          <w:lang w:val="en-US" w:eastAsia="ru-RU"/>
+        </w:rPr>
+        <w:t>(</w:t>
+      </w:r>
+      <w:proofErr w:type="spellStart"/>
+      <w:r>
+        <w:rPr>
+          <w:rFonts w:ascii="Consolas" w:eastAsia="Times New Roman" w:hAnsi="Consolas" w:cs="Times New Roman"/>
+          <w:color w:val="9CDCFE"/>
+          <w:sz w:val="21"/>
+          <w:szCs w:val="21"/>
+          <w:lang w:val="en-US" w:eastAsia="ru-RU"/>
+        </w:rPr>
+        <w:t>document</w:t>
+      </w:r>
+      <w:r>
+        <w:rPr>
+          <w:rFonts w:ascii="Consolas" w:eastAsia="Times New Roman" w:hAnsi="Consolas" w:cs="Times New Roman"/>
+          <w:color w:val="CCCCCC"/>
+          <w:sz w:val="21"/>
+          <w:szCs w:val="21"/>
+          <w:lang w:val="en-US" w:eastAsia="ru-RU"/>
+        </w:rPr>
+        <w:t>.</w:t>
+      </w:r>
+      <w:r>
+        <w:rPr>
+          <w:rFonts w:ascii="Consolas" w:eastAsia="Times New Roman" w:hAnsi="Consolas" w:cs="Times New Roman"/>
+          <w:color w:val="DCDCAA"/>
+          <w:sz w:val="21"/>
+          <w:szCs w:val="21"/>
+          <w:lang w:val="en-US" w:eastAsia="ru-RU"/>
+        </w:rPr>
+        <w:t>getElementById</w:t>
+      </w:r>
+      <w:proofErr w:type="spellEnd"/>
+      <w:r>
+        <w:rPr>
+          <w:rFonts w:ascii="Consolas" w:eastAsia="Times New Roman" w:hAnsi="Consolas" w:cs="Times New Roman"/>
+          <w:color w:val="CCCCCC"/>
+          <w:sz w:val="21"/>
+          <w:szCs w:val="21"/>
+          <w:lang w:val="en-US" w:eastAsia="ru-RU"/>
+        </w:rPr>
+        <w:t>(</w:t>
+      </w:r>
+      <w:r>
+        <w:rPr>
+          <w:rFonts w:ascii="Consolas" w:eastAsia="Times New Roman" w:hAnsi="Consolas" w:cs="Times New Roman"/>
+          <w:color w:val="CE9178"/>
+          <w:sz w:val="21"/>
+          <w:szCs w:val="21"/>
+          <w:lang w:val="en-US" w:eastAsia="ru-RU"/>
+        </w:rPr>
+        <w:t>'root'</w:t>
+      </w:r>
+      <w:r>
+        <w:rPr>
+          <w:rFonts w:ascii="Consolas" w:eastAsia="Times New Roman" w:hAnsi="Consolas" w:cs="Times New Roman"/>
+          <w:color w:val="CCCCCC"/>
+          <w:sz w:val="21"/>
+          <w:szCs w:val="21"/>
+          <w:lang w:val="en-US" w:eastAsia="ru-RU"/>
+        </w:rPr>
+        <w:t>)</w:t>
+      </w:r>
+      <w:r>
+        <w:rPr>
+          <w:rFonts w:ascii="Consolas" w:eastAsia="Times New Roman" w:hAnsi="Consolas" w:cs="Times New Roman"/>
+          <w:color w:val="D4D4D4"/>
+          <w:sz w:val="21"/>
+          <w:szCs w:val="21"/>
+          <w:lang w:val="en-US" w:eastAsia="ru-RU"/>
+        </w:rPr>
+        <w:t>!</w:t>
+      </w:r>
+      <w:r>
+        <w:rPr>
+          <w:rFonts w:ascii="Consolas" w:eastAsia="Times New Roman" w:hAnsi="Consolas" w:cs="Times New Roman"/>
+          <w:color w:val="CCCCCC"/>
+          <w:sz w:val="21"/>
+          <w:szCs w:val="21"/>
+          <w:lang w:val="en-US" w:eastAsia="ru-RU"/>
+        </w:rPr>
+        <w:t>).</w:t>
+      </w:r>
+      <w:r>
+        <w:rPr>
+          <w:rFonts w:ascii="Consolas" w:eastAsia="Times New Roman" w:hAnsi="Consolas" w:cs="Times New Roman"/>
+          <w:color w:val="DCDCAA"/>
+          <w:sz w:val="21"/>
+          <w:szCs w:val="21"/>
+          <w:lang w:val="en-US" w:eastAsia="ru-RU"/>
+        </w:rPr>
+        <w:t>render</w:t>
+      </w:r>
+      <w:r>
+        <w:rPr>
+          <w:rFonts w:ascii="Consolas" w:eastAsia="Times New Roman" w:hAnsi="Consolas" w:cs="Times New Roman"/>
+          <w:color w:val="CCCCCC"/>
+          <w:sz w:val="21"/>
+          <w:szCs w:val="21"/>
+          <w:lang w:val="en-US" w:eastAsia="ru-RU"/>
+        </w:rPr>
+        <w:t>(</w:t>
+      </w:r>
+    </w:p>
+    <w:p>
+      <w:pPr>
+        <w:shd w:val="clear" w:color="auto" w:fill="1F1F1F"/>
+        <w:spacing w:after="0" w:line="285" w:lineRule="atLeast"/>
+        <w:rPr>
+          <w:rFonts w:ascii="Consolas" w:eastAsia="Times New Roman" w:hAnsi="Consolas" w:cs="Times New Roman"/>
+          <w:color w:val="CCCCCC"/>
+          <w:sz w:val="21"/>
+          <w:szCs w:val="21"/>
+          <w:lang w:val="en-US" w:eastAsia="ru-RU"/>
+        </w:rPr>
+      </w:pPr>
+      <w:r>
+        <w:rPr>
+          <w:rFonts w:ascii="Consolas" w:eastAsia="Times New Roman" w:hAnsi="Consolas" w:cs="Times New Roman"/>
+          <w:color w:val="CCCCCC"/>
+          <w:sz w:val="21"/>
+          <w:szCs w:val="21"/>
+          <w:lang w:val="en-US" w:eastAsia="ru-RU"/>
+        </w:rPr>
+        <w:t xml:space="preserve">  </w:t>
+      </w:r>
+      <w:r>
+        <w:rPr>
+          <w:rFonts w:ascii="Consolas" w:eastAsia="Times New Roman" w:hAnsi="Consolas" w:cs="Times New Roman"/>
+          <w:color w:val="808080"/>
+          <w:sz w:val="21"/>
+          <w:szCs w:val="21"/>
+          <w:lang w:val="en-US" w:eastAsia="ru-RU"/>
+        </w:rPr>
+        <w:t>&lt;</w:t>
+      </w:r>
+      <w:proofErr w:type="spellStart"/>
+      <w:r>
+        <w:rPr>
+          <w:rFonts w:ascii="Consolas" w:eastAsia="Times New Roman" w:hAnsi="Consolas" w:cs="Times New Roman"/>
+          <w:color w:val="4EC9B0"/>
+          <w:sz w:val="21"/>
+          <w:szCs w:val="21"/>
+          <w:lang w:val="en-US" w:eastAsia="ru-RU"/>
+        </w:rPr>
+        <w:t>StrictMode</w:t>
+      </w:r>
+      <w:proofErr w:type="spellEnd"/>
+      <w:r>
+        <w:rPr>
+          <w:rFonts w:ascii="Consolas" w:eastAsia="Times New Roman" w:hAnsi="Consolas" w:cs="Times New Roman"/>
+          <w:color w:val="808080"/>
+          <w:sz w:val="21"/>
+          <w:szCs w:val="21"/>
+          <w:lang w:val="en-US" w:eastAsia="ru-RU"/>
+        </w:rPr>
+        <w:t>&gt;</w:t>
+      </w:r>
+    </w:p>
+    <w:p>
+      <w:pPr>
+        <w:shd w:val="clear" w:color="auto" w:fill="1F1F1F"/>
+        <w:spacing w:after="0" w:line="285" w:lineRule="atLeast"/>
+        <w:rPr>
+          <w:rFonts w:ascii="Consolas" w:eastAsia="Times New Roman" w:hAnsi="Consolas" w:cs="Times New Roman"/>
+          <w:color w:val="CCCCCC"/>
+          <w:sz w:val="21"/>
+          <w:szCs w:val="21"/>
+          <w:lang w:val="en-US" w:eastAsia="ru-RU"/>
+        </w:rPr>
+      </w:pPr>
+      <w:r>
+        <w:rPr>
+          <w:rFonts w:ascii="Consolas" w:eastAsia="Times New Roman" w:hAnsi="Consolas" w:cs="Times New Roman"/>
+          <w:color w:val="CCCCCC"/>
+          <w:sz w:val="21"/>
+          <w:szCs w:val="21"/>
+          <w:lang w:val="en-US" w:eastAsia="ru-RU"/>
+        </w:rPr>
+        <w:t xml:space="preserve">    </w:t>
+      </w:r>
+      <w:r>
+        <w:rPr>
+          <w:rFonts w:ascii="Consolas" w:eastAsia="Times New Roman" w:hAnsi="Consolas" w:cs="Times New Roman"/>
+          <w:color w:val="808080"/>
+          <w:sz w:val="21"/>
+          <w:szCs w:val="21"/>
+          <w:lang w:val="en-US" w:eastAsia="ru-RU"/>
+        </w:rPr>
+        <w:t>&lt;</w:t>
+      </w:r>
+      <w:proofErr w:type="spellStart"/>
+      <w:r>
+        <w:rPr>
+          <w:rFonts w:ascii="Consolas" w:eastAsia="Times New Roman" w:hAnsi="Consolas" w:cs="Times New Roman"/>
+          <w:color w:val="4EC9B0"/>
+          <w:sz w:val="21"/>
+          <w:szCs w:val="21"/>
+          <w:lang w:val="en-US" w:eastAsia="ru-RU"/>
+        </w:rPr>
+        <w:t>QueryClientProvider</w:t>
+      </w:r>
+      <w:proofErr w:type="spellEnd"/>
+      <w:r>
+        <w:rPr>
+          <w:rFonts w:ascii="Consolas" w:eastAsia="Times New Roman" w:hAnsi="Consolas" w:cs="Times New Roman"/>
+          <w:color w:val="CCCCCC"/>
+          <w:sz w:val="21"/>
+          <w:szCs w:val="21"/>
+          <w:lang w:val="en-US" w:eastAsia="ru-RU"/>
+        </w:rPr>
+        <w:t xml:space="preserve"> </w:t>
+      </w:r>
+      <w:r>
+        <w:rPr>
+          <w:rFonts w:ascii="Consolas" w:eastAsia="Times New Roman" w:hAnsi="Consolas" w:cs="Times New Roman"/>
+          <w:color w:val="9CDCFE"/>
+          <w:sz w:val="21"/>
+          <w:szCs w:val="21"/>
+          <w:lang w:val="en-US" w:eastAsia="ru-RU"/>
+        </w:rPr>
+        <w:t>client</w:t>
+      </w:r>
+      <w:r>
+        <w:rPr>
+          <w:rFonts w:ascii="Consolas" w:eastAsia="Times New Roman" w:hAnsi="Consolas" w:cs="Times New Roman"/>
+          <w:color w:val="D4D4D4"/>
+          <w:sz w:val="21"/>
+          <w:szCs w:val="21"/>
+          <w:lang w:val="en-US" w:eastAsia="ru-RU"/>
+        </w:rPr>
+        <w:t>=</w:t>
+      </w:r>
+      <w:r>
+        <w:rPr>
+          <w:rFonts w:ascii="Consolas" w:eastAsia="Times New Roman" w:hAnsi="Consolas" w:cs="Times New Roman"/>
+          <w:color w:val="569CD6"/>
+          <w:sz w:val="21"/>
+          <w:szCs w:val="21"/>
+          <w:lang w:val="en-US" w:eastAsia="ru-RU"/>
+        </w:rPr>
+        <w:t>{</w:t>
+      </w:r>
+      <w:proofErr w:type="spellStart"/>
+      <w:r>
+        <w:rPr>
+          <w:rFonts w:ascii="Consolas" w:eastAsia="Times New Roman" w:hAnsi="Consolas" w:cs="Times New Roman"/>
+          <w:color w:val="4FC1FF"/>
+          <w:sz w:val="21"/>
+          <w:szCs w:val="21"/>
+          <w:lang w:val="en-US" w:eastAsia="ru-RU"/>
+        </w:rPr>
+        <w:t>queryClient</w:t>
+      </w:r>
+      <w:proofErr w:type="spellEnd"/>
+      <w:r>
+        <w:rPr>
+          <w:rFonts w:ascii="Consolas" w:eastAsia="Times New Roman" w:hAnsi="Consolas" w:cs="Times New Roman"/>
+          <w:color w:val="569CD6"/>
+          <w:sz w:val="21"/>
+          <w:szCs w:val="21"/>
+          <w:lang w:val="en-US" w:eastAsia="ru-RU"/>
+        </w:rPr>
+        <w:t>}</w:t>
+      </w:r>
+      <w:r>
+        <w:rPr>
+          <w:rFonts w:ascii="Consolas" w:eastAsia="Times New Roman" w:hAnsi="Consolas" w:cs="Times New Roman"/>
+          <w:color w:val="808080"/>
+          <w:sz w:val="21"/>
+          <w:szCs w:val="21"/>
+          <w:lang w:val="en-US" w:eastAsia="ru-RU"/>
+        </w:rPr>
+        <w:t>&gt;</w:t>
+      </w:r>
+    </w:p>
+    <w:p>
+      <w:pPr>
+        <w:shd w:val="clear" w:color="auto" w:fill="1F1F1F"/>
+        <w:spacing w:after="0" w:line="285" w:lineRule="atLeast"/>
+        <w:rPr>
+          <w:rFonts w:ascii="Consolas" w:eastAsia="Times New Roman" w:hAnsi="Consolas" w:cs="Times New Roman"/>
+          <w:color w:val="CCCCCC"/>
+          <w:sz w:val="21"/>
+          <w:szCs w:val="21"/>
+          <w:lang w:val="en-US" w:eastAsia="ru-RU"/>
+        </w:rPr>
+      </w:pPr>
+      <w:r>
+        <w:rPr>
+          <w:rFonts w:ascii="Consolas" w:eastAsia="Times New Roman" w:hAnsi="Consolas" w:cs="Times New Roman"/>
+          <w:color w:val="CCCCCC"/>
+          <w:sz w:val="21"/>
+          <w:szCs w:val="21"/>
+          <w:lang w:val="en-US" w:eastAsia="ru-RU"/>
+        </w:rPr>
+        <w:lastRenderedPageBreak/>
+        <w:t xml:space="preserve">      </w:t>
+      </w:r>
+      <w:r>
+        <w:rPr>
+          <w:rFonts w:ascii="Consolas" w:eastAsia="Times New Roman" w:hAnsi="Consolas" w:cs="Times New Roman"/>
+          <w:color w:val="808080"/>
+          <w:sz w:val="21"/>
+          <w:szCs w:val="21"/>
+          <w:lang w:val="en-US" w:eastAsia="ru-RU"/>
+        </w:rPr>
+        <w:t>&lt;</w:t>
+      </w:r>
+      <w:r>
+        <w:rPr>
+          <w:rFonts w:ascii="Consolas" w:eastAsia="Times New Roman" w:hAnsi="Consolas" w:cs="Times New Roman"/>
+          <w:color w:val="4EC9B0"/>
+          <w:sz w:val="21"/>
+          <w:szCs w:val="21"/>
+          <w:lang w:val="en-US" w:eastAsia="ru-RU"/>
+        </w:rPr>
+        <w:t>App</w:t>
+      </w:r>
+      <w:r>
+        <w:rPr>
+          <w:rFonts w:ascii="Consolas" w:eastAsia="Times New Roman" w:hAnsi="Consolas" w:cs="Times New Roman"/>
+          <w:color w:val="CCCCCC"/>
+          <w:sz w:val="21"/>
+          <w:szCs w:val="21"/>
+          <w:lang w:val="en-US" w:eastAsia="ru-RU"/>
+        </w:rPr>
+        <w:t xml:space="preserve"> </w:t>
+      </w:r>
+      <w:r>
+        <w:rPr>
+          <w:rFonts w:ascii="Consolas" w:eastAsia="Times New Roman" w:hAnsi="Consolas" w:cs="Times New Roman"/>
+          <w:color w:val="808080"/>
+          <w:sz w:val="21"/>
+          <w:szCs w:val="21"/>
+          <w:lang w:val="en-US" w:eastAsia="ru-RU"/>
+        </w:rPr>
+        <w:t>/&gt;</w:t>
+      </w:r>
+    </w:p>
+    <w:p>
+      <w:pPr>
+        <w:shd w:val="clear" w:color="auto" w:fill="1F1F1F"/>
+        <w:spacing w:after="0" w:line="285" w:lineRule="atLeast"/>
+        <w:rPr>
+          <w:rFonts w:ascii="Consolas" w:eastAsia="Times New Roman" w:hAnsi="Consolas" w:cs="Times New Roman"/>
+          <w:color w:val="CCCCCC"/>
+          <w:sz w:val="21"/>
+          <w:szCs w:val="21"/>
+          <w:lang w:eastAsia="ru-RU"/>
+        </w:rPr>
+      </w:pPr>
+      <w:r>
+        <w:rPr>
+          <w:rFonts w:ascii="Consolas" w:eastAsia="Times New Roman" w:hAnsi="Consolas" w:cs="Times New Roman"/>
+          <w:color w:val="CCCCCC"/>
+          <w:sz w:val="21"/>
+          <w:szCs w:val="21"/>
+          <w:lang w:val="en-US" w:eastAsia="ru-RU"/>
+        </w:rPr>
+        <w:t xml:space="preserve">    </w:t>
+      </w:r>
+      <w:r>
+        <w:rPr>
+          <w:rFonts w:ascii="Consolas" w:eastAsia="Times New Roman" w:hAnsi="Consolas" w:cs="Times New Roman"/>
+          <w:color w:val="808080"/>
+          <w:sz w:val="21"/>
+          <w:szCs w:val="21"/>
+          <w:lang w:eastAsia="ru-RU"/>
+        </w:rPr>
+        <w:t>&lt;/</w:t>
+      </w:r>
+      <w:proofErr w:type="spellStart"/>
+      <w:r>
+        <w:rPr>
+          <w:rFonts w:ascii="Consolas" w:eastAsia="Times New Roman" w:hAnsi="Consolas" w:cs="Times New Roman"/>
+          <w:color w:val="4EC9B0"/>
+          <w:sz w:val="21"/>
+          <w:szCs w:val="21"/>
+          <w:lang w:eastAsia="ru-RU"/>
+        </w:rPr>
+        <w:t>QueryClientProvider</w:t>
+      </w:r>
+      <w:proofErr w:type="spellEnd"/>
+      <w:r>
+        <w:rPr>
+          <w:rFonts w:ascii="Consolas" w:eastAsia="Times New Roman" w:hAnsi="Consolas" w:cs="Times New Roman"/>
+          <w:color w:val="808080"/>
+          <w:sz w:val="21"/>
+          <w:szCs w:val="21"/>
+          <w:lang w:eastAsia="ru-RU"/>
+        </w:rPr>
+        <w:t>&gt;</w:t>
+      </w:r>
+    </w:p>
+    <w:p>
+      <w:pPr>
+        <w:shd w:val="clear" w:color="auto" w:fill="1F1F1F"/>
+        <w:spacing w:after="0" w:line="285" w:lineRule="atLeast"/>
+        <w:rPr>
+          <w:rFonts w:ascii="Consolas" w:eastAsia="Times New Roman" w:hAnsi="Consolas" w:cs="Times New Roman"/>
+          <w:color w:val="CCCCCC"/>
+          <w:sz w:val="21"/>
+          <w:szCs w:val="21"/>
+          <w:lang w:eastAsia="ru-RU"/>
+        </w:rPr>
+      </w:pPr>
+      <w:r>
+        <w:rPr>
+          <w:rFonts w:ascii="Consolas" w:eastAsia="Times New Roman" w:hAnsi="Consolas" w:cs="Times New Roman"/>
+          <w:color w:val="CCCCCC"/>
+          <w:sz w:val="21"/>
+          <w:szCs w:val="21"/>
+          <w:lang w:eastAsia="ru-RU"/>
+        </w:rPr>
+        <w:t xml:space="preserve">  </w:t>
+      </w:r>
+      <w:r>
+        <w:rPr>
+          <w:rFonts w:ascii="Consolas" w:eastAsia="Times New Roman" w:hAnsi="Consolas" w:cs="Times New Roman"/>
+          <w:color w:val="808080"/>
+          <w:sz w:val="21"/>
+          <w:szCs w:val="21"/>
+          <w:lang w:eastAsia="ru-RU"/>
+        </w:rPr>
+        <w:t>&lt;/</w:t>
+      </w:r>
+      <w:proofErr w:type="spellStart"/>
+      <w:r>
+        <w:rPr>
+          <w:rFonts w:ascii="Consolas" w:eastAsia="Times New Roman" w:hAnsi="Consolas" w:cs="Times New Roman"/>
+          <w:color w:val="4EC9B0"/>
+          <w:sz w:val="21"/>
+          <w:szCs w:val="21"/>
+          <w:lang w:eastAsia="ru-RU"/>
+        </w:rPr>
+        <w:t>StrictMode</w:t>
+      </w:r>
+      <w:proofErr w:type="spellEnd"/>
+      <w:r>
+        <w:rPr>
+          <w:rFonts w:ascii="Consolas" w:eastAsia="Times New Roman" w:hAnsi="Consolas" w:cs="Times New Roman"/>
+          <w:color w:val="808080"/>
+          <w:sz w:val="21"/>
+          <w:szCs w:val="21"/>
+          <w:lang w:eastAsia="ru-RU"/>
+        </w:rPr>
+        <w:t>&gt;</w:t>
+      </w:r>
+    </w:p>
+    <w:p>
+      <w:pPr>
+        <w:shd w:val="clear" w:color="auto" w:fill="1F1F1F"/>
+        <w:spacing w:after="0" w:line="285" w:lineRule="atLeast"/>
+        <w:rPr>
+          <w:rFonts w:ascii="Consolas" w:eastAsia="Times New Roman" w:hAnsi="Consolas" w:cs="Times New Roman"/>
+          <w:color w:val="CCCCCC"/>
+          <w:sz w:val="21"/>
+          <w:szCs w:val="21"/>
+          <w:lang w:eastAsia="ru-RU"/>
+        </w:rPr>
+      </w:pPr>
+      <w:r>
+        <w:rPr>
+          <w:rFonts w:ascii="Consolas" w:eastAsia="Times New Roman" w:hAnsi="Consolas" w:cs="Times New Roman"/>
+          <w:color w:val="CCCCCC"/>
+          <w:sz w:val="21"/>
+          <w:szCs w:val="21"/>
+          <w:lang w:eastAsia="ru-RU"/>
+        </w:rPr>
+        <w:t>)</w:t>
+      </w:r>
+    </w:p>
+    <w:p>
+      <w:pPr>
+        <w:spacing w:after="0"/>
+        <w:rPr>
+          <w:sz w:val="28"/>
+          <w:szCs w:val="28"/>
+          <w:lang w:val="en-US"/>
+        </w:rPr>
+      </w:pPr>
+    </w:p>
+    <w:p>
+      <w:pPr>
+        <w:spacing w:after="0"/>
+        <w:rPr>
+          <w:sz w:val="28"/>
+          <w:szCs w:val="28"/>
+          <w:lang w:val="uk-UA"/>
+        </w:rPr>
+      </w:pPr>
+      <w:r>
+        <w:rPr>
+          <w:sz w:val="28"/>
+          <w:szCs w:val="28"/>
+          <w:lang w:val="uk-UA"/>
+        </w:rPr>
+        <w:t xml:space="preserve">Видалив шаблонний вміст </w:t>
+      </w:r>
+      <w:proofErr w:type="spellStart"/>
+      <w:r>
+        <w:rPr>
+          <w:sz w:val="28"/>
+          <w:szCs w:val="28"/>
+          <w:lang w:val="en-US"/>
+        </w:rPr>
+        <w:t>App</w:t>
+      </w:r>
+      <w:r>
+        <w:rPr>
+          <w:sz w:val="28"/>
+          <w:szCs w:val="28"/>
+          <w:lang w:val="en-US"/>
+        </w:rPr>
+        <w:t>.</w:t>
+      </w:r>
+      <w:r>
+        <w:rPr>
+          <w:sz w:val="28"/>
+          <w:szCs w:val="28"/>
+          <w:lang w:val="en-US"/>
+        </w:rPr>
+        <w:t>tsx</w:t>
+      </w:r>
+      <w:proofErr w:type="spellEnd"/>
+      <w:r>
+        <w:rPr>
+          <w:sz w:val="28"/>
+          <w:szCs w:val="28"/>
+          <w:lang w:val="en-US"/>
+        </w:rPr>
+        <w:t xml:space="preserve"> </w:t>
+      </w:r>
+      <w:r>
+        <w:rPr>
+          <w:sz w:val="28"/>
+          <w:szCs w:val="28"/>
+          <w:lang w:val="uk-UA"/>
+        </w:rPr>
+        <w:t xml:space="preserve">та </w:t>
+      </w:r>
+      <w:r>
+        <w:rPr>
+          <w:sz w:val="28"/>
+          <w:szCs w:val="28"/>
+          <w:lang w:val="en-US"/>
+        </w:rPr>
+        <w:t>App.css</w:t>
+      </w:r>
+      <w:r>
+        <w:rPr>
+          <w:sz w:val="28"/>
+          <w:szCs w:val="28"/>
+          <w:lang w:val="uk-UA"/>
+        </w:rPr>
+        <w:t>:</w:t>
+      </w:r>
+    </w:p>
+    <w:p>
+      <w:pPr>
+        <w:spacing w:after="0"/>
+        <w:rPr>
+          <w:sz w:val="28"/>
+          <w:szCs w:val="28"/>
+        </w:rPr>
+      </w:pPr>
+      <w:r>
+        <w:rPr>
+          <w:noProof/>
+        </w:rPr>
+        <w:drawing>
+          <wp:inline distT="0" distB="0" distL="0" distR="0" wp14:anchorId="1DDC6D5E" wp14:editId="2C5C773B">
+            <wp:extent cx="6496050" cy="3314700"/>
+            <wp:effectExtent l="0" t="0" r="0" b="0"/>
+            <wp:docPr id="3" name="Рисунок 3"/>
+            <wp:cNvGraphicFramePr>
+              <a:graphicFrameLocks xmlns:a="http://schemas.openxmlformats.org/drawingml/2006/main" noChangeAspect="1"/>
+            </wp:cNvGraphicFramePr>
+            <a:graphic xmlns:a="http://schemas.openxmlformats.org/drawingml/2006/main">
+              <a:graphicData uri="http://schemas.openxmlformats.org/drawingml/2006/picture">
+                <pic:pic xmlns:pic="http://schemas.openxmlformats.org/drawingml/2006/picture">
+                  <pic:nvPicPr>
+                    <pic:cNvPr id="1" name=""/>
+                    <pic:cNvPicPr/>
+                  </pic:nvPicPr>
+                  <pic:blipFill>
+                    <a:blip r:embed="rId6"/>
+                    <a:stretch>
+                      <a:fillRect/>
+                    </a:stretch>
+                  </pic:blipFill>
+                  <pic:spPr>
+                    <a:xfrm>
+                      <a:off x="0" y="0"/>
+                      <a:ext cx="6496050" cy="3314700"/>
+                    </a:xfrm>
+                    <a:prstGeom prst="rect">
+                      <a:avLst/>
+                    </a:prstGeom>
+                  </pic:spPr>
+                </pic:pic>
+              </a:graphicData>
+            </a:graphic>
+          </wp:inline>
+        </w:drawing>
+      </w:r>
+    </w:p>
+    <w:p>
+      <w:pPr>
+        <w:spacing w:after="0"/>
+        <w:rPr>
+          <w:sz w:val="28"/>
+          <w:szCs w:val="28"/>
+        </w:rPr>
+      </w:pPr>
+    </w:p>
+    <w:p>
+      <w:pPr>
+        <w:spacing w:after="0"/>
+        <w:rPr>
+          <w:sz w:val="28"/>
+          <w:szCs w:val="28"/>
+        </w:rPr>
+      </w:pPr>
+      <w:r>
+        <w:rPr>
+          <w:sz w:val="28"/>
+          <w:szCs w:val="28"/>
+        </w:rPr>
+        <w:t xml:space="preserve">Запустив </w:t>
+      </w:r>
+      <w:proofErr w:type="spellStart"/>
+      <w:r>
+        <w:rPr>
+          <w:sz w:val="28"/>
+          <w:szCs w:val="28"/>
+        </w:rPr>
+        <w:t>dev</w:t>
+      </w:r>
+      <w:proofErr w:type="spellEnd"/>
+      <w:r>
+        <w:rPr>
+          <w:sz w:val="28"/>
+          <w:szCs w:val="28"/>
+        </w:rPr>
+        <w:t>-сервер</w:t>
+      </w:r>
+      <w:r>
+        <w:rPr>
+          <w:sz w:val="28"/>
+          <w:szCs w:val="28"/>
+        </w:rPr>
+        <w:t>:</w:t>
+      </w:r>
+    </w:p>
+    <w:p>
+      <w:pPr>
+        <w:spacing w:after="0"/>
+        <w:rPr>
+          <w:sz w:val="28"/>
+          <w:szCs w:val="28"/>
+          <w:lang w:val="en-US"/>
+        </w:rPr>
+      </w:pPr>
+      <w:r>
+        <w:rPr>
+          <w:noProof/>
+        </w:rPr>
+        <w:drawing>
+          <wp:inline distT="0" distB="0" distL="0" distR="0" wp14:anchorId="52A45AE5" wp14:editId="3E1329F0">
+            <wp:extent cx="6645910" cy="2144395"/>
+            <wp:effectExtent l="0" t="0" r="2540" b="8255"/>
+            <wp:docPr id="4" name="Рисунок 4"/>
+            <wp:cNvGraphicFramePr>
+              <a:graphicFrameLocks xmlns:a="http://schemas.openxmlformats.org/drawingml/2006/main" noChangeAspect="1"/>
+            </wp:cNvGraphicFramePr>
+            <a:graphic xmlns:a="http://schemas.openxmlformats.org/drawingml/2006/main">
+              <a:graphicData uri="http://schemas.openxmlformats.org/drawingml/2006/picture">
+                <pic:pic xmlns:pic="http://schemas.openxmlformats.org/drawingml/2006/picture">
+                  <pic:nvPicPr>
+                    <pic:cNvPr id="1" name=""/>
+                    <pic:cNvPicPr/>
+                  </pic:nvPicPr>
+                  <pic:blipFill>
+                    <a:blip r:embed="rId7"/>
+                    <a:stretch>
+                      <a:fillRect/>
+                    </a:stretch>
+                  </pic:blipFill>
+                  <pic:spPr>
+                    <a:xfrm>
+                      <a:off x="0" y="0"/>
+                      <a:ext cx="6645910" cy="2144395"/>
+                    </a:xfrm>
+                    <a:prstGeom prst="rect">
+                      <a:avLst/>
+                    </a:prstGeom>
+                  </pic:spPr>
+                </pic:pic>
+              </a:graphicData>
+            </a:graphic>
+          </wp:inline>
+        </w:drawing>
+      </w:r>
+    </w:p>
+    <w:p>
+      <w:pPr>
+        <w:spacing w:after="0"/>
+        <w:rPr>
+          <w:sz w:val="28"/>
+          <w:szCs w:val="28"/>
+          <w:lang w:val="uk-UA"/>
+        </w:rPr>
+      </w:pPr>
+    </w:p>
+    <w:p>
+      <w:pPr>
+        <w:spacing w:after="0"/>
+        <w:rPr>
+          <w:sz w:val="28"/>
+          <w:szCs w:val="28"/>
+          <w:lang w:val="uk-UA"/>
+        </w:rPr>
+      </w:pPr>
+      <w:r>
+        <w:rPr>
+          <w:sz w:val="28"/>
+          <w:szCs w:val="28"/>
+          <w:lang w:val="uk-UA"/>
+        </w:rPr>
+        <w:t>Зафіксував зміни:</w:t>
+      </w:r>
+    </w:p>
+    <w:p>
+      <w:pPr>
+        <w:spacing w:after="0"/>
+        <w:rPr>
+          <w:sz w:val="28"/>
+          <w:szCs w:val="28"/>
+          <w:lang w:val="uk-UA"/>
+        </w:rPr>
+      </w:pPr>
+      <w:r>
+        <w:rPr>
+          <w:noProof/>
+        </w:rPr>
+        <w:drawing>
+          <wp:inline distT="0" distB="0" distL="0" distR="0" wp14:anchorId="021F38B9" wp14:editId="392C20C7">
+            <wp:extent cx="6645910" cy="1663700"/>
+            <wp:effectExtent l="0" t="0" r="2540" b="0"/>
+            <wp:docPr id="5" name="Рисунок 5"/>
+            <wp:cNvGraphicFramePr>
+              <a:graphicFrameLocks xmlns:a="http://schemas.openxmlformats.org/drawingml/2006/main" noChangeAspect="1"/>
+            </wp:cNvGraphicFramePr>
+            <a:graphic xmlns:a="http://schemas.openxmlformats.org/drawingml/2006/main">
+              <a:graphicData uri="http://schemas.openxmlformats.org/drawingml/2006/picture">
+                <pic:pic xmlns:pic="http://schemas.openxmlformats.org/drawingml/2006/picture">
+                  <pic:nvPicPr>
+                    <pic:cNvPr id="1" name=""/>
+                    <pic:cNvPicPr/>
+                  </pic:nvPicPr>
+                  <pic:blipFill>
+                    <a:blip r:embed="rId8"/>
+                    <a:stretch>
+                      <a:fillRect/>
+                    </a:stretch>
+                  </pic:blipFill>
+                  <pic:spPr>
+                    <a:xfrm>
+                      <a:off x="0" y="0"/>
+                      <a:ext cx="6645910" cy="1663700"/>
+                    </a:xfrm>
+                    <a:prstGeom prst="rect">
+                      <a:avLst/>
+                    </a:prstGeom>
+                  </pic:spPr>
+                </pic:pic>
+              </a:graphicData>
+            </a:graphic>
+          </wp:inline>
+        </w:drawing>
+      </w:r>
+    </w:p>
+    <w:p>
+      <w:pPr>
+        <w:rPr>
+          <w:sz w:val="28"/>
+          <w:szCs w:val="28"/>
+          <w:lang w:val="uk-UA"/>
+        </w:rPr>
+      </w:pPr>
+      <w:r>
+        <w:rPr>
+          <w:sz w:val="28"/>
+          <w:szCs w:val="28"/>
+          <w:lang w:val="uk-UA"/>
+        </w:rPr>
+        <w:br w:type="page"/>
+      </w:r>
+    </w:p>
+    <w:p>
+      <w:pPr>
+        <w:spacing w:after="0"/>
+        <w:rPr>
+          <w:b/>
+          <w:bCs/>
+          <w:sz w:val="28"/>
+          <w:szCs w:val="28"/>
+          <w:lang w:val="uk-UA"/>
+        </w:rPr>
+      </w:pPr>
+      <w:r>
+        <w:rPr>
+          <w:b/>
+          <w:bCs/>
+          <w:sz w:val="28"/>
+          <w:szCs w:val="28"/>
+          <w:lang w:val="uk-UA"/>
+        </w:rPr>
+        <w:lastRenderedPageBreak/>
+        <w:t>Етап №2</w:t>
+      </w:r>
+    </w:p>
+    <w:p>
+      <w:pPr>
+        <w:spacing w:after="0"/>
+        <w:rPr>
+          <w:sz w:val="28"/>
+          <w:szCs w:val="28"/>
+          <w:lang w:val="uk-UA"/>
+        </w:rPr>
+      </w:pPr>
+    </w:p>
+    <w:p>
+      <w:pPr>
+        <w:spacing w:after="0"/>
+        <w:rPr>
+          <w:sz w:val="28"/>
+          <w:szCs w:val="28"/>
+          <w:lang w:val="uk-UA"/>
+        </w:rPr>
+      </w:pPr>
+      <w:r>
+        <w:rPr>
+          <w:sz w:val="28"/>
+          <w:szCs w:val="28"/>
+          <w:lang w:val="uk-UA"/>
+        </w:rPr>
+        <w:t xml:space="preserve">Встановив </w:t>
+      </w:r>
+      <w:r>
+        <w:rPr>
+          <w:sz w:val="28"/>
+          <w:szCs w:val="28"/>
+          <w:lang w:val="en-US"/>
+        </w:rPr>
+        <w:t>JSON Server</w:t>
+      </w:r>
+      <w:r>
+        <w:rPr>
+          <w:sz w:val="28"/>
+          <w:szCs w:val="28"/>
+          <w:lang w:val="uk-UA"/>
+        </w:rPr>
+        <w:t>:</w:t>
+      </w:r>
+    </w:p>
+    <w:p>
+      <w:pPr>
+        <w:spacing w:after="0"/>
+        <w:rPr>
+          <w:sz w:val="28"/>
+          <w:szCs w:val="28"/>
+          <w:lang w:val="en-US"/>
+        </w:rPr>
+      </w:pPr>
+      <w:r>
+        <w:rPr>
+          <w:noProof/>
+        </w:rPr>
+        <w:drawing>
+          <wp:inline distT="0" distB="0" distL="0" distR="0" wp14:anchorId="438320D9" wp14:editId="18EAFA37">
+            <wp:extent cx="6645910" cy="2327910"/>
+            <wp:effectExtent l="0" t="0" r="2540" b="0"/>
+            <wp:docPr id="6" name="Рисунок 6"/>
+            <wp:cNvGraphicFramePr>
+              <a:graphicFrameLocks xmlns:a="http://schemas.openxmlformats.org/drawingml/2006/main" noChangeAspect="1"/>
+            </wp:cNvGraphicFramePr>
+            <a:graphic xmlns:a="http://schemas.openxmlformats.org/drawingml/2006/main">
+              <a:graphicData uri="http://schemas.openxmlformats.org/drawingml/2006/picture">
+                <pic:pic xmlns:pic="http://schemas.openxmlformats.org/drawingml/2006/picture">
+                  <pic:nvPicPr>
+                    <pic:cNvPr id="1" name=""/>
+                    <pic:cNvPicPr/>
+                  </pic:nvPicPr>
+                  <pic:blipFill>
+                    <a:blip r:embed="rId9"/>
+                    <a:stretch>
+                      <a:fillRect/>
+                    </a:stretch>
+                  </pic:blipFill>
+                  <pic:spPr>
+                    <a:xfrm>
+                      <a:off x="0" y="0"/>
+                      <a:ext cx="6645910" cy="2327910"/>
+                    </a:xfrm>
+                    <a:prstGeom prst="rect">
+                      <a:avLst/>
+                    </a:prstGeom>
+                  </pic:spPr>
+                </pic:pic>
+              </a:graphicData>
+            </a:graphic>
+          </wp:inline>
+        </w:drawing>
+      </w:r>
+    </w:p>
+    <w:p>
+      <w:pPr>
+        <w:spacing w:after="0"/>
+        <w:rPr>
+          <w:sz w:val="28"/>
+          <w:szCs w:val="28"/>
+          <w:lang w:val="en-US"/>
+        </w:rPr>
+      </w:pPr>
+    </w:p>
+    <w:p>
+      <w:pPr>
+        <w:spacing w:after="0"/>
+        <w:rPr>
+          <w:sz w:val="28"/>
+          <w:szCs w:val="28"/>
+        </w:rPr>
+      </w:pPr>
+      <w:r>
+        <w:rPr>
+          <w:sz w:val="28"/>
+          <w:szCs w:val="28"/>
+        </w:rPr>
+        <w:t xml:space="preserve">Створив файл </w:t>
+      </w:r>
+      <w:proofErr w:type="spellStart"/>
+      <w:r>
+        <w:rPr>
+          <w:sz w:val="28"/>
+          <w:szCs w:val="28"/>
+          <w:lang w:val="en-US"/>
+        </w:rPr>
+        <w:t>db</w:t>
+      </w:r>
+      <w:proofErr w:type="spellEnd"/>
+      <w:r>
+        <w:rPr>
+          <w:sz w:val="28"/>
+          <w:szCs w:val="28"/>
+        </w:rPr>
+        <w:t>.</w:t>
+      </w:r>
+      <w:r>
+        <w:rPr>
+          <w:sz w:val="28"/>
+          <w:szCs w:val="28"/>
+          <w:lang w:val="en-US"/>
+        </w:rPr>
+        <w:t>json</w:t>
+      </w:r>
+      <w:r>
+        <w:rPr>
+          <w:sz w:val="28"/>
+          <w:szCs w:val="28"/>
+        </w:rPr>
+        <w:t xml:space="preserve"> </w:t>
+      </w:r>
+      <w:r>
+        <w:rPr>
+          <w:sz w:val="28"/>
+          <w:szCs w:val="28"/>
+        </w:rPr>
+        <w:t xml:space="preserve">з </w:t>
+      </w:r>
+      <w:proofErr w:type="spellStart"/>
+      <w:r>
+        <w:rPr>
+          <w:sz w:val="28"/>
+          <w:szCs w:val="28"/>
+        </w:rPr>
+        <w:t>початковими</w:t>
+      </w:r>
+      <w:proofErr w:type="spellEnd"/>
+      <w:r>
+        <w:rPr>
+          <w:sz w:val="28"/>
+          <w:szCs w:val="28"/>
+        </w:rPr>
+        <w:t xml:space="preserve"> </w:t>
+      </w:r>
+      <w:proofErr w:type="spellStart"/>
+      <w:r>
+        <w:rPr>
+          <w:sz w:val="28"/>
+          <w:szCs w:val="28"/>
+        </w:rPr>
+        <w:t>даними</w:t>
+      </w:r>
+      <w:proofErr w:type="spellEnd"/>
+      <w:r>
+        <w:rPr>
+          <w:sz w:val="28"/>
+          <w:szCs w:val="28"/>
+        </w:rPr>
+        <w:t xml:space="preserve"> у </w:t>
+      </w:r>
+      <w:proofErr w:type="spellStart"/>
+      <w:r>
+        <w:rPr>
+          <w:sz w:val="28"/>
+          <w:szCs w:val="28"/>
+        </w:rPr>
+        <w:t>корені</w:t>
+      </w:r>
+      <w:proofErr w:type="spellEnd"/>
+      <w:r>
+        <w:rPr>
+          <w:sz w:val="28"/>
+          <w:szCs w:val="28"/>
+        </w:rPr>
+        <w:t xml:space="preserve"> </w:t>
+      </w:r>
+      <w:proofErr w:type="spellStart"/>
+      <w:r>
+        <w:rPr>
+          <w:sz w:val="28"/>
+          <w:szCs w:val="28"/>
+        </w:rPr>
+        <w:t>папк</w:t>
+      </w:r>
+      <w:proofErr w:type="spellEnd"/>
+      <w:r>
+        <w:rPr>
+          <w:sz w:val="28"/>
+          <w:szCs w:val="28"/>
+          <w:lang w:val="uk-UA"/>
+        </w:rPr>
+        <w:t>и</w:t>
+      </w:r>
+      <w:r>
+        <w:rPr>
+          <w:sz w:val="28"/>
+          <w:szCs w:val="28"/>
+        </w:rPr>
+        <w:t>:</w:t>
+      </w:r>
+    </w:p>
+    <w:p>
+      <w:pPr>
+        <w:spacing w:after="0"/>
+        <w:rPr>
+          <w:sz w:val="28"/>
+          <w:szCs w:val="28"/>
+          <w:lang w:val="uk-UA"/>
+        </w:rPr>
+      </w:pPr>
+      <w:r>
+        <w:rPr>
+          <w:noProof/>
+        </w:rPr>
+        <w:drawing>
+          <wp:inline distT="0" distB="0" distL="0" distR="0" wp14:anchorId="3B6C2B7E" wp14:editId="3FCD5A63">
+            <wp:extent cx="6410325" cy="2400300"/>
+            <wp:effectExtent l="0" t="0" r="9525" b="0"/>
+            <wp:docPr id="7" name="Рисунок 7"/>
+            <wp:cNvGraphicFramePr>
+              <a:graphicFrameLocks xmlns:a="http://schemas.openxmlformats.org/drawingml/2006/main" noChangeAspect="1"/>
+            </wp:cNvGraphicFramePr>
+            <a:graphic xmlns:a="http://schemas.openxmlformats.org/drawingml/2006/main">
+              <a:graphicData uri="http://schemas.openxmlformats.org/drawingml/2006/picture">
+                <pic:pic xmlns:pic="http://schemas.openxmlformats.org/drawingml/2006/picture">
+                  <pic:nvPicPr>
+                    <pic:cNvPr id="1" name=""/>
+                    <pic:cNvPicPr/>
+                  </pic:nvPicPr>
+                  <pic:blipFill>
+                    <a:blip r:embed="rId10"/>
+                    <a:stretch>
+                      <a:fillRect/>
+                    </a:stretch>
+                  </pic:blipFill>
+                  <pic:spPr>
+                    <a:xfrm>
+                      <a:off x="0" y="0"/>
+                      <a:ext cx="6410325" cy="2400300"/>
+                    </a:xfrm>
+                    <a:prstGeom prst="rect">
+                      <a:avLst/>
+                    </a:prstGeom>
+                  </pic:spPr>
+                </pic:pic>
+              </a:graphicData>
+            </a:graphic>
+          </wp:inline>
+        </w:drawing>
+      </w:r>
+    </w:p>
+    <w:p>
+      <w:pPr>
+        <w:spacing w:after="0"/>
+        <w:rPr>
+          <w:sz w:val="28"/>
+          <w:szCs w:val="28"/>
+          <w:lang w:val="uk-UA"/>
+        </w:rPr>
+      </w:pPr>
+    </w:p>
+    <w:p>
+      <w:pPr>
+        <w:spacing w:after="0"/>
+        <w:rPr>
+          <w:sz w:val="28"/>
+          <w:szCs w:val="28"/>
+          <w:lang w:val="uk-UA"/>
+        </w:rPr>
+      </w:pPr>
+      <w:r>
+        <w:rPr>
+          <w:sz w:val="28"/>
+          <w:szCs w:val="28"/>
+          <w:lang w:val="uk-UA"/>
+        </w:rPr>
+        <w:t>Дода</w:t>
+      </w:r>
+      <w:r>
+        <w:rPr>
+          <w:sz w:val="28"/>
+          <w:szCs w:val="28"/>
+          <w:lang w:val="uk-UA"/>
+        </w:rPr>
+        <w:t>в</w:t>
+      </w:r>
+      <w:r>
+        <w:rPr>
+          <w:sz w:val="28"/>
+          <w:szCs w:val="28"/>
+          <w:lang w:val="uk-UA"/>
+        </w:rPr>
+        <w:t xml:space="preserve"> скрипт запуску сервера до секції </w:t>
+      </w:r>
+      <w:proofErr w:type="spellStart"/>
+      <w:r>
+        <w:rPr>
+          <w:sz w:val="28"/>
+          <w:szCs w:val="28"/>
+          <w:lang w:val="uk-UA"/>
+        </w:rPr>
+        <w:t>scripts</w:t>
+      </w:r>
+      <w:proofErr w:type="spellEnd"/>
+      <w:r>
+        <w:rPr>
+          <w:sz w:val="28"/>
+          <w:szCs w:val="28"/>
+          <w:lang w:val="uk-UA"/>
+        </w:rPr>
+        <w:t xml:space="preserve"> у </w:t>
+      </w:r>
+      <w:proofErr w:type="spellStart"/>
+      <w:r>
+        <w:rPr>
+          <w:sz w:val="28"/>
+          <w:szCs w:val="28"/>
+          <w:lang w:val="uk-UA"/>
+        </w:rPr>
+        <w:t>package.json</w:t>
+      </w:r>
+      <w:proofErr w:type="spellEnd"/>
+      <w:r>
+        <w:rPr>
+          <w:sz w:val="28"/>
+          <w:szCs w:val="28"/>
+          <w:lang w:val="uk-UA"/>
+        </w:rPr>
+        <w:t>:</w:t>
+      </w:r>
+    </w:p>
+    <w:p>
+      <w:pPr>
+        <w:spacing w:after="0"/>
+        <w:rPr>
+          <w:sz w:val="28"/>
+          <w:szCs w:val="28"/>
+          <w:lang w:val="uk-UA"/>
+        </w:rPr>
+      </w:pPr>
+      <w:r>
+        <w:rPr>
+          <w:noProof/>
+        </w:rPr>
+        <w:drawing>
+          <wp:inline distT="0" distB="0" distL="0" distR="0" wp14:anchorId="5ED8FC3F" wp14:editId="4B006307">
+            <wp:extent cx="4590854" cy="2943052"/>
+            <wp:effectExtent l="0" t="0" r="635" b="0"/>
+            <wp:docPr id="8" name="Рисунок 8"/>
+            <wp:cNvGraphicFramePr>
+              <a:graphicFrameLocks xmlns:a="http://schemas.openxmlformats.org/drawingml/2006/main" noChangeAspect="1"/>
+            </wp:cNvGraphicFramePr>
+            <a:graphic xmlns:a="http://schemas.openxmlformats.org/drawingml/2006/main">
+              <a:graphicData uri="http://schemas.openxmlformats.org/drawingml/2006/picture">
+                <pic:pic xmlns:pic="http://schemas.openxmlformats.org/drawingml/2006/picture">
+                  <pic:nvPicPr>
+                    <pic:cNvPr id="1" name=""/>
+                    <pic:cNvPicPr/>
+                  </pic:nvPicPr>
+                  <pic:blipFill>
+                    <a:blip r:embed="rId11"/>
+                    <a:stretch>
+                      <a:fillRect/>
+                    </a:stretch>
+                  </pic:blipFill>
+                  <pic:spPr>
+                    <a:xfrm>
+                      <a:off x="0" y="0"/>
+                      <a:ext cx="4606878" cy="2953325"/>
+                    </a:xfrm>
+                    <a:prstGeom prst="rect">
+                      <a:avLst/>
+                    </a:prstGeom>
+                  </pic:spPr>
+                </pic:pic>
+              </a:graphicData>
+            </a:graphic>
+          </wp:inline>
+        </w:drawing>
+      </w:r>
+    </w:p>
+    <w:p>
+      <w:pPr>
+        <w:rPr>
+          <w:sz w:val="28"/>
+          <w:szCs w:val="28"/>
+          <w:lang w:val="uk-UA"/>
+        </w:rPr>
+      </w:pPr>
+      <w:r>
+        <w:rPr>
+          <w:sz w:val="28"/>
+          <w:szCs w:val="28"/>
+          <w:lang w:val="uk-UA"/>
+        </w:rPr>
+        <w:br w:type="page"/>
+      </w:r>
+    </w:p>
+    <w:p>
+      <w:pPr>
+        <w:spacing w:after="0"/>
+        <w:rPr>
+          <w:sz w:val="28"/>
+          <w:szCs w:val="28"/>
+          <w:lang w:val="uk-UA"/>
+        </w:rPr>
+      </w:pPr>
+      <w:r>
+        <w:rPr>
+          <w:sz w:val="28"/>
+          <w:szCs w:val="28"/>
+          <w:lang w:val="uk-UA"/>
+        </w:rPr>
+        <w:lastRenderedPageBreak/>
+        <w:t>Д</w:t>
+      </w:r>
+      <w:r>
+        <w:rPr>
+          <w:sz w:val="28"/>
+          <w:szCs w:val="28"/>
+          <w:lang w:val="uk-UA"/>
+        </w:rPr>
+        <w:t>ода</w:t>
+      </w:r>
+      <w:r>
+        <w:rPr>
+          <w:sz w:val="28"/>
+          <w:szCs w:val="28"/>
+          <w:lang w:val="uk-UA"/>
+        </w:rPr>
+        <w:t>в</w:t>
+      </w:r>
+      <w:r>
+        <w:rPr>
+          <w:sz w:val="28"/>
+          <w:szCs w:val="28"/>
+          <w:lang w:val="uk-UA"/>
+        </w:rPr>
+        <w:t xml:space="preserve"> d</w:t>
+      </w:r>
+      <w:proofErr w:type="spellStart"/>
+      <w:r>
+        <w:rPr>
+          <w:sz w:val="28"/>
+          <w:szCs w:val="28"/>
+          <w:lang w:val="uk-UA"/>
+        </w:rPr>
+        <w:t>b.json</w:t>
+      </w:r>
+      <w:proofErr w:type="spellEnd"/>
+      <w:r>
+        <w:rPr>
+          <w:sz w:val="28"/>
+          <w:szCs w:val="28"/>
+          <w:lang w:val="uk-UA"/>
+        </w:rPr>
+        <w:t xml:space="preserve"> до ігнорованих файлів у </w:t>
+      </w:r>
+      <w:proofErr w:type="spellStart"/>
+      <w:r>
+        <w:rPr>
+          <w:sz w:val="28"/>
+          <w:szCs w:val="28"/>
+          <w:lang w:val="uk-UA"/>
+        </w:rPr>
+        <w:t>vite.config.ts</w:t>
+      </w:r>
+      <w:proofErr w:type="spellEnd"/>
+      <w:r>
+        <w:rPr>
+          <w:sz w:val="28"/>
+          <w:szCs w:val="28"/>
+          <w:lang w:val="uk-UA"/>
+        </w:rPr>
+        <w:t>:</w:t>
+      </w:r>
+    </w:p>
+    <w:p>
+      <w:pPr>
+        <w:shd w:val="clear" w:color="auto" w:fill="1F1F1F"/>
+        <w:spacing w:after="0" w:line="285" w:lineRule="atLeast"/>
+        <w:rPr>
+          <w:rFonts w:ascii="Consolas" w:eastAsia="Times New Roman" w:hAnsi="Consolas" w:cs="Times New Roman"/>
+          <w:color w:val="CCCCCC"/>
+          <w:sz w:val="21"/>
+          <w:szCs w:val="21"/>
+          <w:lang w:val="en-US" w:eastAsia="ru-RU"/>
+        </w:rPr>
+      </w:pPr>
+      <w:r>
+        <w:rPr>
+          <w:rFonts w:ascii="Consolas" w:eastAsia="Times New Roman" w:hAnsi="Consolas" w:cs="Times New Roman"/>
+          <w:color w:val="C586C0"/>
+          <w:sz w:val="21"/>
+          <w:szCs w:val="21"/>
+          <w:lang w:val="en-US" w:eastAsia="ru-RU"/>
+        </w:rPr>
+        <w:t>import</w:t>
+      </w:r>
+      <w:r>
+        <w:rPr>
+          <w:rFonts w:ascii="Consolas" w:eastAsia="Times New Roman" w:hAnsi="Consolas" w:cs="Times New Roman"/>
+          <w:color w:val="CCCCCC"/>
+          <w:sz w:val="21"/>
+          <w:szCs w:val="21"/>
+          <w:lang w:val="en-US" w:eastAsia="ru-RU"/>
+        </w:rPr>
+        <w:t xml:space="preserve"> { </w:t>
+      </w:r>
+      <w:proofErr w:type="spellStart"/>
+      <w:r>
+        <w:rPr>
+          <w:rFonts w:ascii="Consolas" w:eastAsia="Times New Roman" w:hAnsi="Consolas" w:cs="Times New Roman"/>
+          <w:color w:val="9CDCFE"/>
+          <w:sz w:val="21"/>
+          <w:szCs w:val="21"/>
+          <w:lang w:val="en-US" w:eastAsia="ru-RU"/>
+        </w:rPr>
+        <w:t>defineConfig</w:t>
+      </w:r>
+      <w:proofErr w:type="spellEnd"/>
+      <w:r>
+        <w:rPr>
+          <w:rFonts w:ascii="Consolas" w:eastAsia="Times New Roman" w:hAnsi="Consolas" w:cs="Times New Roman"/>
+          <w:color w:val="CCCCCC"/>
+          <w:sz w:val="21"/>
+          <w:szCs w:val="21"/>
+          <w:lang w:val="en-US" w:eastAsia="ru-RU"/>
+        </w:rPr>
+        <w:t xml:space="preserve"> } </w:t>
+      </w:r>
+      <w:r>
+        <w:rPr>
+          <w:rFonts w:ascii="Consolas" w:eastAsia="Times New Roman" w:hAnsi="Consolas" w:cs="Times New Roman"/>
+          <w:color w:val="C586C0"/>
+          <w:sz w:val="21"/>
+          <w:szCs w:val="21"/>
+          <w:lang w:val="en-US" w:eastAsia="ru-RU"/>
+        </w:rPr>
+        <w:t>from</w:t>
+      </w:r>
+      <w:r>
+        <w:rPr>
+          <w:rFonts w:ascii="Consolas" w:eastAsia="Times New Roman" w:hAnsi="Consolas" w:cs="Times New Roman"/>
+          <w:color w:val="CCCCCC"/>
+          <w:sz w:val="21"/>
+          <w:szCs w:val="21"/>
+          <w:lang w:val="en-US" w:eastAsia="ru-RU"/>
+        </w:rPr>
+        <w:t xml:space="preserve"> </w:t>
+      </w:r>
+      <w:r>
+        <w:rPr>
+          <w:rFonts w:ascii="Consolas" w:eastAsia="Times New Roman" w:hAnsi="Consolas" w:cs="Times New Roman"/>
+          <w:color w:val="CE9178"/>
+          <w:sz w:val="21"/>
+          <w:szCs w:val="21"/>
+          <w:lang w:val="en-US" w:eastAsia="ru-RU"/>
+        </w:rPr>
+        <w:t>'</w:t>
+      </w:r>
+      <w:proofErr w:type="spellStart"/>
+      <w:r>
+        <w:rPr>
+          <w:rFonts w:ascii="Consolas" w:eastAsia="Times New Roman" w:hAnsi="Consolas" w:cs="Times New Roman"/>
+          <w:color w:val="CE9178"/>
+          <w:sz w:val="21"/>
+          <w:szCs w:val="21"/>
+          <w:lang w:val="en-US" w:eastAsia="ru-RU"/>
+        </w:rPr>
+        <w:t>vite</w:t>
+      </w:r>
+      <w:proofErr w:type="spellEnd"/>
+      <w:r>
+        <w:rPr>
+          <w:rFonts w:ascii="Consolas" w:eastAsia="Times New Roman" w:hAnsi="Consolas" w:cs="Times New Roman"/>
+          <w:color w:val="CE9178"/>
+          <w:sz w:val="21"/>
+          <w:szCs w:val="21"/>
+          <w:lang w:val="en-US" w:eastAsia="ru-RU"/>
+        </w:rPr>
+        <w:t>'</w:t>
+      </w:r>
+    </w:p>
+    <w:p>
+      <w:pPr>
+        <w:shd w:val="clear" w:color="auto" w:fill="1F1F1F"/>
+        <w:spacing w:after="0" w:line="285" w:lineRule="atLeast"/>
+        <w:rPr>
+          <w:rFonts w:ascii="Consolas" w:eastAsia="Times New Roman" w:hAnsi="Consolas" w:cs="Times New Roman"/>
+          <w:color w:val="CCCCCC"/>
+          <w:sz w:val="21"/>
+          <w:szCs w:val="21"/>
+          <w:lang w:val="en-US" w:eastAsia="ru-RU"/>
+        </w:rPr>
+      </w:pPr>
+      <w:r>
+        <w:rPr>
+          <w:rFonts w:ascii="Consolas" w:eastAsia="Times New Roman" w:hAnsi="Consolas" w:cs="Times New Roman"/>
+          <w:color w:val="C586C0"/>
+          <w:sz w:val="21"/>
+          <w:szCs w:val="21"/>
+          <w:lang w:val="en-US" w:eastAsia="ru-RU"/>
+        </w:rPr>
+        <w:t>import</w:t>
+      </w:r>
+      <w:r>
+        <w:rPr>
+          <w:rFonts w:ascii="Consolas" w:eastAsia="Times New Roman" w:hAnsi="Consolas" w:cs="Times New Roman"/>
+          <w:color w:val="CCCCCC"/>
+          <w:sz w:val="21"/>
+          <w:szCs w:val="21"/>
+          <w:lang w:val="en-US" w:eastAsia="ru-RU"/>
+        </w:rPr>
+        <w:t xml:space="preserve"> </w:t>
+      </w:r>
+      <w:r>
+        <w:rPr>
+          <w:rFonts w:ascii="Consolas" w:eastAsia="Times New Roman" w:hAnsi="Consolas" w:cs="Times New Roman"/>
+          <w:color w:val="9CDCFE"/>
+          <w:sz w:val="21"/>
+          <w:szCs w:val="21"/>
+          <w:lang w:val="en-US" w:eastAsia="ru-RU"/>
+        </w:rPr>
+        <w:t>react</w:t>
+      </w:r>
+      <w:r>
+        <w:rPr>
+          <w:rFonts w:ascii="Consolas" w:eastAsia="Times New Roman" w:hAnsi="Consolas" w:cs="Times New Roman"/>
+          <w:color w:val="CCCCCC"/>
+          <w:sz w:val="21"/>
+          <w:szCs w:val="21"/>
+          <w:lang w:val="en-US" w:eastAsia="ru-RU"/>
+        </w:rPr>
+        <w:t xml:space="preserve"> </w:t>
+      </w:r>
+      <w:r>
+        <w:rPr>
+          <w:rFonts w:ascii="Consolas" w:eastAsia="Times New Roman" w:hAnsi="Consolas" w:cs="Times New Roman"/>
+          <w:color w:val="C586C0"/>
+          <w:sz w:val="21"/>
+          <w:szCs w:val="21"/>
+          <w:lang w:val="en-US" w:eastAsia="ru-RU"/>
+        </w:rPr>
+        <w:t>from</w:t>
+      </w:r>
+      <w:r>
+        <w:rPr>
+          <w:rFonts w:ascii="Consolas" w:eastAsia="Times New Roman" w:hAnsi="Consolas" w:cs="Times New Roman"/>
+          <w:color w:val="CCCCCC"/>
+          <w:sz w:val="21"/>
+          <w:szCs w:val="21"/>
+          <w:lang w:val="en-US" w:eastAsia="ru-RU"/>
+        </w:rPr>
+        <w:t xml:space="preserve"> </w:t>
+      </w:r>
+      <w:r>
+        <w:rPr>
+          <w:rFonts w:ascii="Consolas" w:eastAsia="Times New Roman" w:hAnsi="Consolas" w:cs="Times New Roman"/>
+          <w:color w:val="CE9178"/>
+          <w:sz w:val="21"/>
+          <w:szCs w:val="21"/>
+          <w:lang w:val="en-US" w:eastAsia="ru-RU"/>
+        </w:rPr>
+        <w:t>'@</w:t>
+      </w:r>
+      <w:proofErr w:type="spellStart"/>
+      <w:r>
+        <w:rPr>
+          <w:rFonts w:ascii="Consolas" w:eastAsia="Times New Roman" w:hAnsi="Consolas" w:cs="Times New Roman"/>
+          <w:color w:val="CE9178"/>
+          <w:sz w:val="21"/>
+          <w:szCs w:val="21"/>
+          <w:lang w:val="en-US" w:eastAsia="ru-RU"/>
+        </w:rPr>
+        <w:t>vitejs</w:t>
+      </w:r>
+      <w:proofErr w:type="spellEnd"/>
+      <w:r>
+        <w:rPr>
+          <w:rFonts w:ascii="Consolas" w:eastAsia="Times New Roman" w:hAnsi="Consolas" w:cs="Times New Roman"/>
+          <w:color w:val="CE9178"/>
+          <w:sz w:val="21"/>
+          <w:szCs w:val="21"/>
+          <w:lang w:val="en-US" w:eastAsia="ru-RU"/>
+        </w:rPr>
+        <w:t>/plugin-react'</w:t>
+      </w:r>
+    </w:p>
+    <w:p>
+      <w:pPr>
+        <w:shd w:val="clear" w:color="auto" w:fill="1F1F1F"/>
+        <w:spacing w:after="0" w:line="285" w:lineRule="atLeast"/>
+        <w:rPr>
+          <w:rFonts w:ascii="Consolas" w:eastAsia="Times New Roman" w:hAnsi="Consolas" w:cs="Times New Roman"/>
+          <w:color w:val="CCCCCC"/>
+          <w:sz w:val="21"/>
+          <w:szCs w:val="21"/>
+          <w:lang w:val="en-US" w:eastAsia="ru-RU"/>
+        </w:rPr>
+      </w:pPr>
+    </w:p>
+    <w:p>
+      <w:pPr>
+        <w:shd w:val="clear" w:color="auto" w:fill="1F1F1F"/>
+        <w:spacing w:after="0" w:line="285" w:lineRule="atLeast"/>
+        <w:rPr>
+          <w:rFonts w:ascii="Consolas" w:eastAsia="Times New Roman" w:hAnsi="Consolas" w:cs="Times New Roman"/>
+          <w:color w:val="CCCCCC"/>
+          <w:sz w:val="21"/>
+          <w:szCs w:val="21"/>
+          <w:lang w:val="en-US" w:eastAsia="ru-RU"/>
+        </w:rPr>
+      </w:pPr>
+      <w:r>
+        <w:rPr>
+          <w:rFonts w:ascii="Consolas" w:eastAsia="Times New Roman" w:hAnsi="Consolas" w:cs="Times New Roman"/>
+          <w:color w:val="6A9955"/>
+          <w:sz w:val="21"/>
+          <w:szCs w:val="21"/>
+          <w:lang w:val="en-US" w:eastAsia="ru-RU"/>
+        </w:rPr>
+        <w:t>// https://vite.dev/config/</w:t>
+      </w:r>
+    </w:p>
+    <w:p>
+      <w:pPr>
+        <w:shd w:val="clear" w:color="auto" w:fill="1F1F1F"/>
+        <w:spacing w:after="0" w:line="285" w:lineRule="atLeast"/>
+        <w:rPr>
+          <w:rFonts w:ascii="Consolas" w:eastAsia="Times New Roman" w:hAnsi="Consolas" w:cs="Times New Roman"/>
+          <w:color w:val="CCCCCC"/>
+          <w:sz w:val="21"/>
+          <w:szCs w:val="21"/>
+          <w:lang w:val="en-US" w:eastAsia="ru-RU"/>
+        </w:rPr>
+      </w:pPr>
+      <w:r>
+        <w:rPr>
+          <w:rFonts w:ascii="Consolas" w:eastAsia="Times New Roman" w:hAnsi="Consolas" w:cs="Times New Roman"/>
+          <w:color w:val="C586C0"/>
+          <w:sz w:val="21"/>
+          <w:szCs w:val="21"/>
+          <w:lang w:val="en-US" w:eastAsia="ru-RU"/>
+        </w:rPr>
+        <w:t>export</w:t>
+      </w:r>
+      <w:r>
+        <w:rPr>
+          <w:rFonts w:ascii="Consolas" w:eastAsia="Times New Roman" w:hAnsi="Consolas" w:cs="Times New Roman"/>
+          <w:color w:val="CCCCCC"/>
+          <w:sz w:val="21"/>
+          <w:szCs w:val="21"/>
+          <w:lang w:val="en-US" w:eastAsia="ru-RU"/>
+        </w:rPr>
+        <w:t xml:space="preserve"> </w:t>
+      </w:r>
+      <w:r>
+        <w:rPr>
+          <w:rFonts w:ascii="Consolas" w:eastAsia="Times New Roman" w:hAnsi="Consolas" w:cs="Times New Roman"/>
+          <w:color w:val="C586C0"/>
+          <w:sz w:val="21"/>
+          <w:szCs w:val="21"/>
+          <w:lang w:val="en-US" w:eastAsia="ru-RU"/>
+        </w:rPr>
+        <w:t>default</w:t>
+      </w:r>
+      <w:r>
+        <w:rPr>
+          <w:rFonts w:ascii="Consolas" w:eastAsia="Times New Roman" w:hAnsi="Consolas" w:cs="Times New Roman"/>
+          <w:color w:val="CCCCCC"/>
+          <w:sz w:val="21"/>
+          <w:szCs w:val="21"/>
+          <w:lang w:val="en-US" w:eastAsia="ru-RU"/>
+        </w:rPr>
+        <w:t xml:space="preserve"> </w:t>
+      </w:r>
+      <w:proofErr w:type="spellStart"/>
+      <w:r>
+        <w:rPr>
+          <w:rFonts w:ascii="Consolas" w:eastAsia="Times New Roman" w:hAnsi="Consolas" w:cs="Times New Roman"/>
+          <w:color w:val="DCDCAA"/>
+          <w:sz w:val="21"/>
+          <w:szCs w:val="21"/>
+          <w:lang w:val="en-US" w:eastAsia="ru-RU"/>
+        </w:rPr>
+        <w:t>defineConfig</w:t>
+      </w:r>
+      <w:proofErr w:type="spellEnd"/>
+      <w:r>
+        <w:rPr>
+          <w:rFonts w:ascii="Consolas" w:eastAsia="Times New Roman" w:hAnsi="Consolas" w:cs="Times New Roman"/>
+          <w:color w:val="CCCCCC"/>
+          <w:sz w:val="21"/>
+          <w:szCs w:val="21"/>
+          <w:lang w:val="en-US" w:eastAsia="ru-RU"/>
+        </w:rPr>
+        <w:t>({</w:t>
+      </w:r>
+    </w:p>
+    <w:p>
+      <w:pPr>
+        <w:shd w:val="clear" w:color="auto" w:fill="1F1F1F"/>
+        <w:spacing w:after="0" w:line="285" w:lineRule="atLeast"/>
+        <w:rPr>
+          <w:rFonts w:ascii="Consolas" w:eastAsia="Times New Roman" w:hAnsi="Consolas" w:cs="Times New Roman"/>
+          <w:color w:val="CCCCCC"/>
+          <w:sz w:val="21"/>
+          <w:szCs w:val="21"/>
+          <w:lang w:val="en-US" w:eastAsia="ru-RU"/>
+        </w:rPr>
+      </w:pPr>
+      <w:r>
+        <w:rPr>
+          <w:rFonts w:ascii="Consolas" w:eastAsia="Times New Roman" w:hAnsi="Consolas" w:cs="Times New Roman"/>
+          <w:color w:val="CCCCCC"/>
+          <w:sz w:val="21"/>
+          <w:szCs w:val="21"/>
+          <w:lang w:val="en-US" w:eastAsia="ru-RU"/>
+        </w:rPr>
+        <w:t xml:space="preserve">  </w:t>
+      </w:r>
+      <w:r>
+        <w:rPr>
+          <w:rFonts w:ascii="Consolas" w:eastAsia="Times New Roman" w:hAnsi="Consolas" w:cs="Times New Roman"/>
+          <w:color w:val="9CDCFE"/>
+          <w:sz w:val="21"/>
+          <w:szCs w:val="21"/>
+          <w:lang w:val="en-US" w:eastAsia="ru-RU"/>
+        </w:rPr>
+        <w:t>plugins:</w:t>
+      </w:r>
+      <w:r>
+        <w:rPr>
+          <w:rFonts w:ascii="Consolas" w:eastAsia="Times New Roman" w:hAnsi="Consolas" w:cs="Times New Roman"/>
+          <w:color w:val="CCCCCC"/>
+          <w:sz w:val="21"/>
+          <w:szCs w:val="21"/>
+          <w:lang w:val="en-US" w:eastAsia="ru-RU"/>
+        </w:rPr>
+        <w:t xml:space="preserve"> [</w:t>
+      </w:r>
+      <w:r>
+        <w:rPr>
+          <w:rFonts w:ascii="Consolas" w:eastAsia="Times New Roman" w:hAnsi="Consolas" w:cs="Times New Roman"/>
+          <w:color w:val="DCDCAA"/>
+          <w:sz w:val="21"/>
+          <w:szCs w:val="21"/>
+          <w:lang w:val="en-US" w:eastAsia="ru-RU"/>
+        </w:rPr>
+        <w:t>react</w:t>
+      </w:r>
+      <w:r>
+        <w:rPr>
+          <w:rFonts w:ascii="Consolas" w:eastAsia="Times New Roman" w:hAnsi="Consolas" w:cs="Times New Roman"/>
+          <w:color w:val="CCCCCC"/>
+          <w:sz w:val="21"/>
+          <w:szCs w:val="21"/>
+          <w:lang w:val="en-US" w:eastAsia="ru-RU"/>
+        </w:rPr>
+        <w:t>()],</w:t>
+      </w:r>
+    </w:p>
+    <w:p>
+      <w:pPr>
+        <w:shd w:val="clear" w:color="auto" w:fill="1F1F1F"/>
+        <w:spacing w:after="0" w:line="285" w:lineRule="atLeast"/>
+        <w:rPr>
+          <w:rFonts w:ascii="Consolas" w:eastAsia="Times New Roman" w:hAnsi="Consolas" w:cs="Times New Roman"/>
+          <w:color w:val="CCCCCC"/>
+          <w:sz w:val="21"/>
+          <w:szCs w:val="21"/>
+          <w:lang w:val="en-US" w:eastAsia="ru-RU"/>
+        </w:rPr>
+      </w:pPr>
+      <w:r>
+        <w:rPr>
+          <w:rFonts w:ascii="Consolas" w:eastAsia="Times New Roman" w:hAnsi="Consolas" w:cs="Times New Roman"/>
+          <w:color w:val="CCCCCC"/>
+          <w:sz w:val="21"/>
+          <w:szCs w:val="21"/>
+          <w:lang w:val="en-US" w:eastAsia="ru-RU"/>
+        </w:rPr>
+        <w:t xml:space="preserve">  </w:t>
+      </w:r>
+      <w:r>
+        <w:rPr>
+          <w:rFonts w:ascii="Consolas" w:eastAsia="Times New Roman" w:hAnsi="Consolas" w:cs="Times New Roman"/>
+          <w:color w:val="9CDCFE"/>
+          <w:sz w:val="21"/>
+          <w:szCs w:val="21"/>
+          <w:lang w:val="en-US" w:eastAsia="ru-RU"/>
+        </w:rPr>
+        <w:t>server:</w:t>
+      </w:r>
+      <w:r>
+        <w:rPr>
+          <w:rFonts w:ascii="Consolas" w:eastAsia="Times New Roman" w:hAnsi="Consolas" w:cs="Times New Roman"/>
+          <w:color w:val="CCCCCC"/>
+          <w:sz w:val="21"/>
+          <w:szCs w:val="21"/>
+          <w:lang w:val="en-US" w:eastAsia="ru-RU"/>
+        </w:rPr>
+        <w:t xml:space="preserve"> {</w:t>
+      </w:r>
+    </w:p>
+    <w:p>
+      <w:pPr>
+        <w:shd w:val="clear" w:color="auto" w:fill="1F1F1F"/>
+        <w:spacing w:after="0" w:line="285" w:lineRule="atLeast"/>
+        <w:rPr>
+          <w:rFonts w:ascii="Consolas" w:eastAsia="Times New Roman" w:hAnsi="Consolas" w:cs="Times New Roman"/>
+          <w:color w:val="CCCCCC"/>
+          <w:sz w:val="21"/>
+          <w:szCs w:val="21"/>
+          <w:lang w:val="en-US" w:eastAsia="ru-RU"/>
+        </w:rPr>
+      </w:pPr>
+      <w:r>
+        <w:rPr>
+          <w:rFonts w:ascii="Consolas" w:eastAsia="Times New Roman" w:hAnsi="Consolas" w:cs="Times New Roman"/>
+          <w:color w:val="CCCCCC"/>
+          <w:sz w:val="21"/>
+          <w:szCs w:val="21"/>
+          <w:lang w:val="en-US" w:eastAsia="ru-RU"/>
+        </w:rPr>
+        <w:t xml:space="preserve">    </w:t>
+      </w:r>
+      <w:r>
+        <w:rPr>
+          <w:rFonts w:ascii="Consolas" w:eastAsia="Times New Roman" w:hAnsi="Consolas" w:cs="Times New Roman"/>
+          <w:color w:val="9CDCFE"/>
+          <w:sz w:val="21"/>
+          <w:szCs w:val="21"/>
+          <w:lang w:val="en-US" w:eastAsia="ru-RU"/>
+        </w:rPr>
+        <w:t>watch:</w:t>
+      </w:r>
+      <w:r>
+        <w:rPr>
+          <w:rFonts w:ascii="Consolas" w:eastAsia="Times New Roman" w:hAnsi="Consolas" w:cs="Times New Roman"/>
+          <w:color w:val="CCCCCC"/>
+          <w:sz w:val="21"/>
+          <w:szCs w:val="21"/>
+          <w:lang w:val="en-US" w:eastAsia="ru-RU"/>
+        </w:rPr>
+        <w:t xml:space="preserve"> {</w:t>
+      </w:r>
+    </w:p>
+    <w:p>
+      <w:pPr>
+        <w:shd w:val="clear" w:color="auto" w:fill="1F1F1F"/>
+        <w:spacing w:after="0" w:line="285" w:lineRule="atLeast"/>
+        <w:rPr>
+          <w:rFonts w:ascii="Consolas" w:eastAsia="Times New Roman" w:hAnsi="Consolas" w:cs="Times New Roman"/>
+          <w:color w:val="CCCCCC"/>
+          <w:sz w:val="21"/>
+          <w:szCs w:val="21"/>
+          <w:lang w:val="en-US" w:eastAsia="ru-RU"/>
+        </w:rPr>
+      </w:pPr>
+      <w:r>
+        <w:rPr>
+          <w:rFonts w:ascii="Consolas" w:eastAsia="Times New Roman" w:hAnsi="Consolas" w:cs="Times New Roman"/>
+          <w:color w:val="CCCCCC"/>
+          <w:sz w:val="21"/>
+          <w:szCs w:val="21"/>
+          <w:lang w:val="en-US" w:eastAsia="ru-RU"/>
+        </w:rPr>
+        <w:t xml:space="preserve">      </w:t>
+      </w:r>
+      <w:r>
+        <w:rPr>
+          <w:rFonts w:ascii="Consolas" w:eastAsia="Times New Roman" w:hAnsi="Consolas" w:cs="Times New Roman"/>
+          <w:color w:val="9CDCFE"/>
+          <w:sz w:val="21"/>
+          <w:szCs w:val="21"/>
+          <w:lang w:val="en-US" w:eastAsia="ru-RU"/>
+        </w:rPr>
+        <w:t>ignored:</w:t>
+      </w:r>
+      <w:r>
+        <w:rPr>
+          <w:rFonts w:ascii="Consolas" w:eastAsia="Times New Roman" w:hAnsi="Consolas" w:cs="Times New Roman"/>
+          <w:color w:val="CCCCCC"/>
+          <w:sz w:val="21"/>
+          <w:szCs w:val="21"/>
+          <w:lang w:val="en-US" w:eastAsia="ru-RU"/>
+        </w:rPr>
+        <w:t xml:space="preserve"> [</w:t>
+      </w:r>
+      <w:r>
+        <w:rPr>
+          <w:rFonts w:ascii="Consolas" w:eastAsia="Times New Roman" w:hAnsi="Consolas" w:cs="Times New Roman"/>
+          <w:color w:val="CE9178"/>
+          <w:sz w:val="21"/>
+          <w:szCs w:val="21"/>
+          <w:lang w:val="en-US" w:eastAsia="ru-RU"/>
+        </w:rPr>
+        <w:t>"**/</w:t>
+      </w:r>
+      <w:proofErr w:type="spellStart"/>
+      <w:r>
+        <w:rPr>
+          <w:rFonts w:ascii="Consolas" w:eastAsia="Times New Roman" w:hAnsi="Consolas" w:cs="Times New Roman"/>
+          <w:color w:val="CE9178"/>
+          <w:sz w:val="21"/>
+          <w:szCs w:val="21"/>
+          <w:lang w:val="en-US" w:eastAsia="ru-RU"/>
+        </w:rPr>
+        <w:t>db.json</w:t>
+      </w:r>
+      <w:proofErr w:type="spellEnd"/>
+      <w:r>
+        <w:rPr>
+          <w:rFonts w:ascii="Consolas" w:eastAsia="Times New Roman" w:hAnsi="Consolas" w:cs="Times New Roman"/>
+          <w:color w:val="CE9178"/>
+          <w:sz w:val="21"/>
+          <w:szCs w:val="21"/>
+          <w:lang w:val="en-US" w:eastAsia="ru-RU"/>
+        </w:rPr>
+        <w:t>"</w:t>
+      </w:r>
+      <w:r>
+        <w:rPr>
+          <w:rFonts w:ascii="Consolas" w:eastAsia="Times New Roman" w:hAnsi="Consolas" w:cs="Times New Roman"/>
+          <w:color w:val="CCCCCC"/>
+          <w:sz w:val="21"/>
+          <w:szCs w:val="21"/>
+          <w:lang w:val="en-US" w:eastAsia="ru-RU"/>
+        </w:rPr>
+        <w:t>],</w:t>
+      </w:r>
+    </w:p>
+    <w:p>
+      <w:pPr>
+        <w:shd w:val="clear" w:color="auto" w:fill="1F1F1F"/>
+        <w:spacing w:after="0" w:line="285" w:lineRule="atLeast"/>
+        <w:rPr>
+          <w:rFonts w:ascii="Consolas" w:eastAsia="Times New Roman" w:hAnsi="Consolas" w:cs="Times New Roman"/>
+          <w:color w:val="CCCCCC"/>
+          <w:sz w:val="21"/>
+          <w:szCs w:val="21"/>
+          <w:lang w:eastAsia="ru-RU"/>
+        </w:rPr>
+      </w:pPr>
+      <w:r>
+        <w:rPr>
+          <w:rFonts w:ascii="Consolas" w:eastAsia="Times New Roman" w:hAnsi="Consolas" w:cs="Times New Roman"/>
+          <w:color w:val="CCCCCC"/>
+          <w:sz w:val="21"/>
+          <w:szCs w:val="21"/>
+          <w:lang w:val="en-US" w:eastAsia="ru-RU"/>
+        </w:rPr>
+        <w:t xml:space="preserve">    </w:t>
+      </w:r>
+      <w:r>
+        <w:rPr>
+          <w:rFonts w:ascii="Consolas" w:eastAsia="Times New Roman" w:hAnsi="Consolas" w:cs="Times New Roman"/>
+          <w:color w:val="CCCCCC"/>
+          <w:sz w:val="21"/>
+          <w:szCs w:val="21"/>
+          <w:lang w:eastAsia="ru-RU"/>
+        </w:rPr>
+        <w:t>},</w:t>
+      </w:r>
+    </w:p>
+    <w:p>
+      <w:pPr>
+        <w:shd w:val="clear" w:color="auto" w:fill="1F1F1F"/>
+        <w:spacing w:after="0" w:line="285" w:lineRule="atLeast"/>
+        <w:rPr>
+          <w:rFonts w:ascii="Consolas" w:eastAsia="Times New Roman" w:hAnsi="Consolas" w:cs="Times New Roman"/>
+          <w:color w:val="CCCCCC"/>
+          <w:sz w:val="21"/>
+          <w:szCs w:val="21"/>
+          <w:lang w:eastAsia="ru-RU"/>
+        </w:rPr>
+      </w:pPr>
+      <w:r>
+        <w:rPr>
+          <w:rFonts w:ascii="Consolas" w:eastAsia="Times New Roman" w:hAnsi="Consolas" w:cs="Times New Roman"/>
+          <w:color w:val="CCCCCC"/>
+          <w:sz w:val="21"/>
+          <w:szCs w:val="21"/>
+          <w:lang w:eastAsia="ru-RU"/>
+        </w:rPr>
+        <w:t>  },</w:t>
+      </w:r>
+    </w:p>
+    <w:p>
+      <w:pPr>
+        <w:shd w:val="clear" w:color="auto" w:fill="1F1F1F"/>
+        <w:spacing w:after="0" w:line="285" w:lineRule="atLeast"/>
+        <w:rPr>
+          <w:rFonts w:ascii="Consolas" w:eastAsia="Times New Roman" w:hAnsi="Consolas" w:cs="Times New Roman"/>
+          <w:color w:val="CCCCCC"/>
+          <w:sz w:val="21"/>
+          <w:szCs w:val="21"/>
+          <w:lang w:eastAsia="ru-RU"/>
+        </w:rPr>
+      </w:pPr>
+      <w:r>
+        <w:rPr>
+          <w:rFonts w:ascii="Consolas" w:eastAsia="Times New Roman" w:hAnsi="Consolas" w:cs="Times New Roman"/>
+          <w:color w:val="CCCCCC"/>
+          <w:sz w:val="21"/>
+          <w:szCs w:val="21"/>
+          <w:lang w:eastAsia="ru-RU"/>
+        </w:rPr>
+        <w:t>});</w:t>
+      </w:r>
+    </w:p>
+    <w:p>
+      <w:pPr>
+        <w:shd w:val="clear" w:color="auto" w:fill="1F1F1F"/>
+        <w:spacing w:after="0" w:line="285" w:lineRule="atLeast"/>
+        <w:rPr>
+          <w:rFonts w:ascii="Consolas" w:eastAsia="Times New Roman" w:hAnsi="Consolas" w:cs="Times New Roman"/>
+          <w:color w:val="CCCCCC"/>
+          <w:sz w:val="21"/>
+          <w:szCs w:val="21"/>
+          <w:lang w:eastAsia="ru-RU"/>
+        </w:rPr>
+      </w:pPr>
+    </w:p>
+    <w:p>
+      <w:pPr>
+        <w:spacing w:after="0"/>
+        <w:rPr>
+          <w:sz w:val="28"/>
+          <w:szCs w:val="28"/>
+        </w:rPr>
+      </w:pPr>
+    </w:p>
+    <w:p>
+      <w:pPr>
+        <w:spacing w:after="0"/>
+        <w:rPr>
+          <w:sz w:val="28"/>
+          <w:szCs w:val="28"/>
+        </w:rPr>
+      </w:pPr>
+      <w:r>
+        <w:rPr>
+          <w:sz w:val="28"/>
+          <w:szCs w:val="28"/>
+        </w:rPr>
+        <w:t xml:space="preserve">Запустив </w:t>
+      </w:r>
+      <w:r>
+        <w:rPr>
+          <w:sz w:val="28"/>
+          <w:szCs w:val="28"/>
+        </w:rPr>
+        <w:t xml:space="preserve">JSON Server у </w:t>
+      </w:r>
+      <w:proofErr w:type="spellStart"/>
+      <w:r>
+        <w:rPr>
+          <w:sz w:val="28"/>
+          <w:szCs w:val="28"/>
+        </w:rPr>
+        <w:t>окремому</w:t>
+      </w:r>
+      <w:proofErr w:type="spellEnd"/>
+      <w:r>
+        <w:rPr>
+          <w:sz w:val="28"/>
+          <w:szCs w:val="28"/>
+        </w:rPr>
+        <w:t xml:space="preserve"> </w:t>
+      </w:r>
+      <w:proofErr w:type="spellStart"/>
+      <w:r>
+        <w:rPr>
+          <w:sz w:val="28"/>
+          <w:szCs w:val="28"/>
+        </w:rPr>
+        <w:t>терміналі</w:t>
+      </w:r>
+      <w:proofErr w:type="spellEnd"/>
+      <w:r>
+        <w:rPr>
+          <w:sz w:val="28"/>
+          <w:szCs w:val="28"/>
+        </w:rPr>
+        <w:t>:</w:t>
+      </w:r>
+    </w:p>
+    <w:p>
+      <w:pPr>
+        <w:spacing w:after="0"/>
+        <w:rPr>
+          <w:sz w:val="28"/>
+          <w:szCs w:val="28"/>
+        </w:rPr>
+      </w:pPr>
+      <w:r>
+        <w:rPr>
+          <w:noProof/>
+        </w:rPr>
+        <w:drawing>
+          <wp:inline distT="0" distB="0" distL="0" distR="0" wp14:anchorId="1E814539" wp14:editId="0D657D38">
+            <wp:extent cx="5628412" cy="3403076"/>
+            <wp:effectExtent l="0" t="0" r="0" b="6985"/>
+            <wp:docPr id="9" name="Рисунок 9"/>
+            <wp:cNvGraphicFramePr>
+              <a:graphicFrameLocks xmlns:a="http://schemas.openxmlformats.org/drawingml/2006/main" noChangeAspect="1"/>
+            </wp:cNvGraphicFramePr>
+            <a:graphic xmlns:a="http://schemas.openxmlformats.org/drawingml/2006/main">
+              <a:graphicData uri="http://schemas.openxmlformats.org/drawingml/2006/picture">
+                <pic:pic xmlns:pic="http://schemas.openxmlformats.org/drawingml/2006/picture">
+                  <pic:nvPicPr>
+                    <pic:cNvPr id="1" name=""/>
+                    <pic:cNvPicPr/>
+                  </pic:nvPicPr>
+                  <pic:blipFill>
+                    <a:blip r:embed="rId12"/>
+                    <a:stretch>
+                      <a:fillRect/>
+                    </a:stretch>
+                  </pic:blipFill>
+                  <pic:spPr>
+                    <a:xfrm>
+                      <a:off x="0" y="0"/>
+                      <a:ext cx="5643864" cy="3412419"/>
+                    </a:xfrm>
+                    <a:prstGeom prst="rect">
+                      <a:avLst/>
+                    </a:prstGeom>
+                  </pic:spPr>
+                </pic:pic>
+              </a:graphicData>
+            </a:graphic>
+          </wp:inline>
+        </w:drawing>
+      </w:r>
+    </w:p>
+    <w:p>
+      <w:pPr>
+        <w:spacing w:after="0"/>
+        <w:rPr>
+          <w:sz w:val="28"/>
+          <w:szCs w:val="28"/>
+        </w:rPr>
+      </w:pPr>
+      <w:r>
+        <w:rPr>
+          <w:noProof/>
+        </w:rPr>
+        <w:drawing>
+          <wp:inline distT="0" distB="0" distL="0" distR="0" wp14:anchorId="4237BBB9" wp14:editId="1A0318F9">
+            <wp:extent cx="5628005" cy="2023522"/>
+            <wp:effectExtent l="0" t="0" r="0" b="0"/>
+            <wp:docPr id="10" name="Рисунок 10"/>
+            <wp:cNvGraphicFramePr>
+              <a:graphicFrameLocks xmlns:a="http://schemas.openxmlformats.org/drawingml/2006/main" noChangeAspect="1"/>
+            </wp:cNvGraphicFramePr>
+            <a:graphic xmlns:a="http://schemas.openxmlformats.org/drawingml/2006/main">
+              <a:graphicData uri="http://schemas.openxmlformats.org/drawingml/2006/picture">
+                <pic:pic xmlns:pic="http://schemas.openxmlformats.org/drawingml/2006/picture">
+                  <pic:nvPicPr>
+                    <pic:cNvPr id="1" name=""/>
+                    <pic:cNvPicPr/>
+                  </pic:nvPicPr>
+                  <pic:blipFill>
+                    <a:blip r:embed="rId13"/>
+                    <a:stretch>
+                      <a:fillRect/>
+                    </a:stretch>
+                  </pic:blipFill>
+                  <pic:spPr>
+                    <a:xfrm>
+                      <a:off x="0" y="0"/>
+                      <a:ext cx="5644774" cy="2029551"/>
+                    </a:xfrm>
+                    <a:prstGeom prst="rect">
+                      <a:avLst/>
+                    </a:prstGeom>
+                  </pic:spPr>
+                </pic:pic>
+              </a:graphicData>
+            </a:graphic>
+          </wp:inline>
+        </w:drawing>
+      </w:r>
+    </w:p>
+    <w:p>
+      <w:pPr>
+        <w:spacing w:after="0"/>
+        <w:rPr>
+          <w:sz w:val="28"/>
+          <w:szCs w:val="28"/>
+          <w:lang w:val="uk-UA"/>
+        </w:rPr>
+      </w:pPr>
+      <w:proofErr w:type="spellStart"/>
+      <w:r>
+        <w:rPr>
+          <w:sz w:val="28"/>
+          <w:szCs w:val="28"/>
+        </w:rPr>
+        <w:t>Заф</w:t>
+      </w:r>
+      <w:r>
+        <w:rPr>
+          <w:sz w:val="28"/>
+          <w:szCs w:val="28"/>
+          <w:lang w:val="uk-UA"/>
+        </w:rPr>
+        <w:t>іксував</w:t>
+      </w:r>
+      <w:proofErr w:type="spellEnd"/>
+      <w:r>
+        <w:rPr>
+          <w:sz w:val="28"/>
+          <w:szCs w:val="28"/>
+          <w:lang w:val="uk-UA"/>
+        </w:rPr>
+        <w:t xml:space="preserve"> зміни:</w:t>
+      </w:r>
+    </w:p>
+    <w:p>
+      <w:pPr>
+        <w:spacing w:after="0"/>
+        <w:rPr>
+          <w:sz w:val="28"/>
+          <w:szCs w:val="28"/>
+          <w:lang w:val="en-US"/>
+        </w:rPr>
+      </w:pPr>
+      <w:r>
+        <w:rPr>
+          <w:noProof/>
+        </w:rPr>
+        <w:drawing>
+          <wp:inline distT="0" distB="0" distL="0" distR="0" wp14:anchorId="49C72749" wp14:editId="2D3C4D98">
+            <wp:extent cx="5157485" cy="1018094"/>
+            <wp:effectExtent l="0" t="0" r="5080" b="0"/>
+            <wp:docPr id="11" name="Рисунок 11"/>
+            <wp:cNvGraphicFramePr>
+              <a:graphicFrameLocks xmlns:a="http://schemas.openxmlformats.org/drawingml/2006/main" noChangeAspect="1"/>
+            </wp:cNvGraphicFramePr>
+            <a:graphic xmlns:a="http://schemas.openxmlformats.org/drawingml/2006/main">
+              <a:graphicData uri="http://schemas.openxmlformats.org/drawingml/2006/picture">
+                <pic:pic xmlns:pic="http://schemas.openxmlformats.org/drawingml/2006/picture">
+                  <pic:nvPicPr>
+                    <pic:cNvPr id="1" name=""/>
+                    <pic:cNvPicPr/>
+                  </pic:nvPicPr>
+                  <pic:blipFill>
+                    <a:blip r:embed="rId14"/>
+                    <a:stretch>
+                      <a:fillRect/>
+                    </a:stretch>
+                  </pic:blipFill>
+                  <pic:spPr>
+                    <a:xfrm>
+                      <a:off x="0" y="0"/>
+                      <a:ext cx="5216067" cy="1029658"/>
+                    </a:xfrm>
+                    <a:prstGeom prst="rect">
+                      <a:avLst/>
+                    </a:prstGeom>
+                  </pic:spPr>
+                </pic:pic>
+              </a:graphicData>
+            </a:graphic>
+          </wp:inline>
+        </w:drawing>
+      </w:r>
+    </w:p>
+    <w:p>
+      <w:pPr>
+        <w:spacing w:after="0"/>
+        <w:rPr>
+          <w:b/>
+          <w:bCs/>
+          <w:sz w:val="28"/>
+          <w:szCs w:val="28"/>
+          <w:lang w:val="en-US"/>
+        </w:rPr>
+      </w:pPr>
+      <w:proofErr w:type="spellStart"/>
+      <w:r>
+        <w:rPr>
+          <w:b/>
+          <w:bCs/>
+          <w:sz w:val="28"/>
+          <w:szCs w:val="28"/>
+        </w:rPr>
+        <w:lastRenderedPageBreak/>
+        <w:t>Етап</w:t>
+      </w:r>
+      <w:proofErr w:type="spellEnd"/>
+      <w:r>
+        <w:rPr>
+          <w:b/>
+          <w:bCs/>
+          <w:sz w:val="28"/>
+          <w:szCs w:val="28"/>
+        </w:rPr>
+        <w:t xml:space="preserve"> №</w:t>
+      </w:r>
+      <w:r>
+        <w:rPr>
+          <w:b/>
+          <w:bCs/>
+          <w:sz w:val="28"/>
+          <w:szCs w:val="28"/>
+          <w:lang w:val="en-US"/>
+        </w:rPr>
+        <w:t>3</w:t>
+      </w:r>
+    </w:p>
+    <w:p>
+      <w:pPr>
+        <w:spacing w:after="0"/>
+        <w:rPr>
+          <w:sz w:val="28"/>
+          <w:szCs w:val="28"/>
+          <w:lang w:val="en-US"/>
+        </w:rPr>
+      </w:pPr>
+    </w:p>
+    <w:p>
+      <w:pPr>
+        <w:spacing w:after="0"/>
+        <w:rPr>
+          <w:sz w:val="28"/>
+          <w:szCs w:val="28"/>
+          <w:lang w:val="uk-UA"/>
+        </w:rPr>
+      </w:pPr>
+      <w:r>
+        <w:rPr>
+          <w:sz w:val="28"/>
+          <w:szCs w:val="28"/>
+          <w:lang w:val="uk-UA"/>
+        </w:rPr>
+        <w:t>Розробив файлову систему:</w:t>
+      </w:r>
+    </w:p>
+    <w:tbl>
+      <w:tblPr>
+        <w:tblStyle w:val="a7"/>
+        <w:tblW w:w="0" w:type="auto"/>
+        <w:tblLook w:val="04A0" w:firstRow="1" w:lastRow="0" w:firstColumn="1" w:lastColumn="0" w:noHBand="0" w:noVBand="1"/>
+      </w:tblPr>
+      <w:tblGrid>
+        <w:gridCol w:w="4995"/>
+        <w:gridCol w:w="5461"/>
+      </w:tblGrid>
+      <w:tr>
+        <w:tc>
+          <w:tcPr>
+            <w:tcW w:w="10456" w:type="dxa"/>
+            <w:gridSpan w:val="2"/>
+          </w:tcPr>
+          <w:p>
+            <w:pPr>
+              <w:rPr>
+                <w:sz w:val="28"/>
+                <w:szCs w:val="28"/>
+                <w:lang w:val="uk-UA"/>
+              </w:rPr>
+            </w:pPr>
+            <w:r>
+              <w:rPr>
+                <w:noProof/>
+              </w:rPr>
+              <w:drawing>
+                <wp:inline distT="0" distB="0" distL="0" distR="0" wp14:anchorId="2619AAA6" wp14:editId="41B472DA">
+                  <wp:extent cx="5915025" cy="2400300"/>
+                  <wp:effectExtent l="0" t="0" r="9525" b="0"/>
+                  <wp:docPr id="13" name="Рисунок 13"/>
+                  <wp:cNvGraphicFramePr>
+                    <a:graphicFrameLocks xmlns:a="http://schemas.openxmlformats.org/drawingml/2006/main" noChangeAspect="1"/>
+                  </wp:cNvGraphicFramePr>
+                  <a:graphic xmlns:a="http://schemas.openxmlformats.org/drawingml/2006/main">
+                    <a:graphicData uri="http://schemas.openxmlformats.org/drawingml/2006/picture">
+                      <pic:pic xmlns:pic="http://schemas.openxmlformats.org/drawingml/2006/picture">
+                        <pic:nvPicPr>
+                          <pic:cNvPr id="1" name=""/>
+                          <pic:cNvPicPr/>
+                        </pic:nvPicPr>
+                        <pic:blipFill>
+                          <a:blip r:embed="rId15"/>
+                          <a:stretch>
+                            <a:fillRect/>
+                          </a:stretch>
+                        </pic:blipFill>
+                        <pic:spPr>
+                          <a:xfrm>
+                            <a:off x="0" y="0"/>
+                            <a:ext cx="5915025" cy="2400300"/>
+                          </a:xfrm>
+                          <a:prstGeom prst="rect">
+                            <a:avLst/>
+                          </a:prstGeom>
+                        </pic:spPr>
+                      </pic:pic>
+                    </a:graphicData>
+                  </a:graphic>
+                </wp:inline>
+              </w:drawing>
+            </w:r>
+          </w:p>
+        </w:tc>
+      </w:tr>
+      <w:tr>
+        <w:tc>
+          <w:tcPr>
+            <w:tcW w:w="5228" w:type="dxa"/>
+          </w:tcPr>
+          <w:p>
+            <w:pPr>
+              <w:rPr>
+                <w:sz w:val="28"/>
+                <w:szCs w:val="28"/>
+                <w:lang w:val="uk-UA"/>
+              </w:rPr>
+            </w:pPr>
+            <w:r>
+              <w:rPr>
+                <w:noProof/>
+              </w:rPr>
+              <w:drawing>
+                <wp:inline distT="0" distB="0" distL="0" distR="0" wp14:anchorId="2B1B49AF" wp14:editId="50E68874">
+                  <wp:extent cx="3152775" cy="1333500"/>
+                  <wp:effectExtent l="0" t="0" r="9525" b="0"/>
+                  <wp:docPr id="14" name="Рисунок 14"/>
+                  <wp:cNvGraphicFramePr>
+                    <a:graphicFrameLocks xmlns:a="http://schemas.openxmlformats.org/drawingml/2006/main" noChangeAspect="1"/>
+                  </wp:cNvGraphicFramePr>
+                  <a:graphic xmlns:a="http://schemas.openxmlformats.org/drawingml/2006/main">
+                    <a:graphicData uri="http://schemas.openxmlformats.org/drawingml/2006/picture">
+                      <pic:pic xmlns:pic="http://schemas.openxmlformats.org/drawingml/2006/picture">
+                        <pic:nvPicPr>
+                          <pic:cNvPr id="1" name=""/>
+                          <pic:cNvPicPr/>
+                        </pic:nvPicPr>
+                        <pic:blipFill>
+                          <a:blip r:embed="rId16"/>
+                          <a:stretch>
+                            <a:fillRect/>
+                          </a:stretch>
+                        </pic:blipFill>
+                        <pic:spPr>
+                          <a:xfrm>
+                            <a:off x="0" y="0"/>
+                            <a:ext cx="3152775" cy="1333500"/>
+                          </a:xfrm>
+                          <a:prstGeom prst="rect">
+                            <a:avLst/>
+                          </a:prstGeom>
+                        </pic:spPr>
+                      </pic:pic>
+                    </a:graphicData>
+                  </a:graphic>
+                </wp:inline>
+              </w:drawing>
+            </w:r>
+            <w:r>
+              <w:rPr>
+                <w:sz w:val="28"/>
+                <w:szCs w:val="28"/>
+                <w:lang w:val="uk-UA"/>
+              </w:rPr>
+              <w:t xml:space="preserve"> </w:t>
+            </w:r>
+          </w:p>
+        </w:tc>
+        <w:tc>
+          <w:tcPr>
+            <w:tcW w:w="5228" w:type="dxa"/>
+          </w:tcPr>
+          <w:p>
+            <w:pPr>
+              <w:rPr>
+                <w:sz w:val="28"/>
+                <w:szCs w:val="28"/>
+                <w:lang w:val="uk-UA"/>
+              </w:rPr>
+            </w:pPr>
+            <w:r>
+              <w:rPr>
+                <w:noProof/>
+              </w:rPr>
+              <w:drawing>
+                <wp:inline distT="0" distB="0" distL="0" distR="0" wp14:anchorId="151B5E15" wp14:editId="1838C909">
+                  <wp:extent cx="3471519" cy="1251122"/>
+                  <wp:effectExtent l="0" t="0" r="0" b="6350"/>
+                  <wp:docPr id="15" name="Рисунок 15"/>
+                  <wp:cNvGraphicFramePr>
+                    <a:graphicFrameLocks xmlns:a="http://schemas.openxmlformats.org/drawingml/2006/main" noChangeAspect="1"/>
+                  </wp:cNvGraphicFramePr>
+                  <a:graphic xmlns:a="http://schemas.openxmlformats.org/drawingml/2006/main">
+                    <a:graphicData uri="http://schemas.openxmlformats.org/drawingml/2006/picture">
+                      <pic:pic xmlns:pic="http://schemas.openxmlformats.org/drawingml/2006/picture">
+                        <pic:nvPicPr>
+                          <pic:cNvPr id="1" name=""/>
+                          <pic:cNvPicPr/>
+                        </pic:nvPicPr>
+                        <pic:blipFill>
+                          <a:blip r:embed="rId17"/>
+                          <a:stretch>
+                            <a:fillRect/>
+                          </a:stretch>
+                        </pic:blipFill>
+                        <pic:spPr>
+                          <a:xfrm>
+                            <a:off x="0" y="0"/>
+                            <a:ext cx="3502643" cy="1262339"/>
+                          </a:xfrm>
+                          <a:prstGeom prst="rect">
+                            <a:avLst/>
+                          </a:prstGeom>
+                        </pic:spPr>
+                      </pic:pic>
+                    </a:graphicData>
+                  </a:graphic>
+                </wp:inline>
+              </w:drawing>
+            </w:r>
+          </w:p>
+        </w:tc>
+      </w:tr>
+    </w:tbl>
+    <w:p>
+      <w:pPr>
+        <w:spacing w:after="0"/>
+        <w:rPr>
+          <w:sz w:val="28"/>
+          <w:szCs w:val="28"/>
+          <w:lang w:val="uk-UA"/>
+        </w:rPr>
+      </w:pPr>
+    </w:p>
+    <w:p>
+      <w:pPr>
+        <w:spacing w:after="0"/>
+        <w:rPr>
+          <w:sz w:val="28"/>
+          <w:szCs w:val="28"/>
+          <w:lang w:val="uk-UA"/>
+        </w:rPr>
+      </w:pPr>
+      <w:r>
+        <w:rPr>
+          <w:sz w:val="28"/>
+          <w:szCs w:val="28"/>
+          <w:lang w:val="uk-UA"/>
+        </w:rPr>
+        <w:t>Опи</w:t>
+      </w:r>
+      <w:r>
+        <w:rPr>
+          <w:sz w:val="28"/>
+          <w:szCs w:val="28"/>
+          <w:lang w:val="uk-UA"/>
+        </w:rPr>
+        <w:t>сав</w:t>
+      </w:r>
+      <w:r>
+        <w:rPr>
+          <w:sz w:val="28"/>
+          <w:szCs w:val="28"/>
+          <w:lang w:val="uk-UA"/>
+        </w:rPr>
+        <w:t xml:space="preserve"> інтерфейс </w:t>
+      </w:r>
+      <w:proofErr w:type="spellStart"/>
+      <w:r>
+        <w:rPr>
+          <w:sz w:val="28"/>
+          <w:szCs w:val="28"/>
+          <w:lang w:val="uk-UA"/>
+        </w:rPr>
+        <w:t>Todo</w:t>
+      </w:r>
+      <w:proofErr w:type="spellEnd"/>
+      <w:r>
+        <w:rPr>
+          <w:sz w:val="28"/>
+          <w:szCs w:val="28"/>
+          <w:lang w:val="uk-UA"/>
+        </w:rPr>
+        <w:t xml:space="preserve"> з полями </w:t>
+      </w:r>
+      <w:proofErr w:type="spellStart"/>
+      <w:r>
+        <w:rPr>
+          <w:sz w:val="28"/>
+          <w:szCs w:val="28"/>
+          <w:lang w:val="uk-UA"/>
+        </w:rPr>
+        <w:t>id</w:t>
+      </w:r>
+      <w:proofErr w:type="spellEnd"/>
+      <w:r>
+        <w:rPr>
+          <w:sz w:val="28"/>
+          <w:szCs w:val="28"/>
+          <w:lang w:val="uk-UA"/>
+        </w:rPr>
+        <w:t xml:space="preserve">: </w:t>
+      </w:r>
+      <w:proofErr w:type="spellStart"/>
+      <w:r>
+        <w:rPr>
+          <w:sz w:val="28"/>
+          <w:szCs w:val="28"/>
+          <w:lang w:val="uk-UA"/>
+        </w:rPr>
+        <w:t>number</w:t>
+      </w:r>
+      <w:proofErr w:type="spellEnd"/>
+      <w:r>
+        <w:rPr>
+          <w:sz w:val="28"/>
+          <w:szCs w:val="28"/>
+          <w:lang w:val="uk-UA"/>
+        </w:rPr>
+        <w:t xml:space="preserve">, </w:t>
+      </w:r>
+      <w:proofErr w:type="spellStart"/>
+      <w:r>
+        <w:rPr>
+          <w:sz w:val="28"/>
+          <w:szCs w:val="28"/>
+          <w:lang w:val="uk-UA"/>
+        </w:rPr>
+        <w:t>title</w:t>
+      </w:r>
+      <w:proofErr w:type="spellEnd"/>
+      <w:r>
+        <w:rPr>
+          <w:sz w:val="28"/>
+          <w:szCs w:val="28"/>
+          <w:lang w:val="uk-UA"/>
+        </w:rPr>
+        <w:t xml:space="preserve">: </w:t>
+      </w:r>
+      <w:proofErr w:type="spellStart"/>
+      <w:r>
+        <w:rPr>
+          <w:sz w:val="28"/>
+          <w:szCs w:val="28"/>
+          <w:lang w:val="uk-UA"/>
+        </w:rPr>
+        <w:t>string</w:t>
+      </w:r>
+      <w:proofErr w:type="spellEnd"/>
+      <w:r>
+        <w:rPr>
+          <w:sz w:val="28"/>
+          <w:szCs w:val="28"/>
+          <w:lang w:val="uk-UA"/>
+        </w:rPr>
+        <w:t xml:space="preserve">, </w:t>
+      </w:r>
+      <w:proofErr w:type="spellStart"/>
+      <w:r>
+        <w:rPr>
+          <w:sz w:val="28"/>
+          <w:szCs w:val="28"/>
+          <w:lang w:val="uk-UA"/>
+        </w:rPr>
+        <w:t>completed</w:t>
+      </w:r>
+      <w:proofErr w:type="spellEnd"/>
+      <w:r>
+        <w:rPr>
+          <w:sz w:val="28"/>
+          <w:szCs w:val="28"/>
+          <w:lang w:val="uk-UA"/>
+        </w:rPr>
+        <w:t xml:space="preserve">: </w:t>
+      </w:r>
+      <w:proofErr w:type="spellStart"/>
+      <w:r>
+        <w:rPr>
+          <w:sz w:val="28"/>
+          <w:szCs w:val="28"/>
+          <w:lang w:val="uk-UA"/>
+        </w:rPr>
+        <w:t>boolean</w:t>
+      </w:r>
+      <w:proofErr w:type="spellEnd"/>
+      <w:r>
+        <w:rPr>
+          <w:sz w:val="28"/>
+          <w:szCs w:val="28"/>
+          <w:lang w:val="uk-UA"/>
+        </w:rPr>
+        <w:t>. Дода</w:t>
+      </w:r>
+      <w:r>
+        <w:rPr>
+          <w:sz w:val="28"/>
+          <w:szCs w:val="28"/>
+          <w:lang w:val="uk-UA"/>
+        </w:rPr>
+        <w:t>в</w:t>
+      </w:r>
+      <w:r>
+        <w:rPr>
+          <w:sz w:val="28"/>
+          <w:szCs w:val="28"/>
+          <w:lang w:val="uk-UA"/>
+        </w:rPr>
+        <w:t xml:space="preserve"> допоміжні типи </w:t>
+      </w:r>
+      <w:proofErr w:type="spellStart"/>
+      <w:r>
+        <w:rPr>
+          <w:sz w:val="28"/>
+          <w:szCs w:val="28"/>
+          <w:lang w:val="uk-UA"/>
+        </w:rPr>
+        <w:t>CreateTodoDto</w:t>
+      </w:r>
+      <w:proofErr w:type="spellEnd"/>
+      <w:r>
+        <w:rPr>
+          <w:sz w:val="28"/>
+          <w:szCs w:val="28"/>
+          <w:lang w:val="uk-UA"/>
+        </w:rPr>
+        <w:t xml:space="preserve"> та </w:t>
+      </w:r>
+      <w:proofErr w:type="spellStart"/>
+      <w:r>
+        <w:rPr>
+          <w:sz w:val="28"/>
+          <w:szCs w:val="28"/>
+          <w:lang w:val="uk-UA"/>
+        </w:rPr>
+        <w:t>UpdateTodoDto</w:t>
+      </w:r>
+      <w:proofErr w:type="spellEnd"/>
+      <w:r>
+        <w:rPr>
+          <w:sz w:val="28"/>
+          <w:szCs w:val="28"/>
+          <w:lang w:val="uk-UA"/>
+        </w:rPr>
+        <w:t xml:space="preserve"> </w:t>
+      </w:r>
+      <w:r>
+        <w:rPr>
+          <w:sz w:val="28"/>
+          <w:szCs w:val="28"/>
+          <w:lang w:val="uk-UA"/>
+        </w:rPr>
+        <w:t xml:space="preserve">, де </w:t>
+      </w:r>
+      <w:r>
+        <w:rPr>
+          <w:sz w:val="28"/>
+          <w:szCs w:val="28"/>
+          <w:lang w:val="uk-UA"/>
+        </w:rPr>
+        <w:t xml:space="preserve">усі поля </w:t>
+      </w:r>
+      <w:proofErr w:type="spellStart"/>
+      <w:r>
+        <w:rPr>
+          <w:sz w:val="28"/>
+          <w:szCs w:val="28"/>
+          <w:lang w:val="uk-UA"/>
+        </w:rPr>
+        <w:t>Todo</w:t>
+      </w:r>
+      <w:proofErr w:type="spellEnd"/>
+      <w:r>
+        <w:rPr>
+          <w:sz w:val="28"/>
+          <w:szCs w:val="28"/>
+          <w:lang w:val="uk-UA"/>
+        </w:rPr>
+        <w:t xml:space="preserve"> </w:t>
+      </w:r>
+      <w:proofErr w:type="spellStart"/>
+      <w:r>
+        <w:rPr>
+          <w:sz w:val="28"/>
+          <w:szCs w:val="28"/>
+          <w:lang w:val="uk-UA"/>
+        </w:rPr>
+        <w:t>опціональні</w:t>
+      </w:r>
+      <w:proofErr w:type="spellEnd"/>
+      <w:r>
+        <w:rPr>
+          <w:sz w:val="28"/>
+          <w:szCs w:val="28"/>
+          <w:lang w:val="uk-UA"/>
+        </w:rPr>
+        <w:t xml:space="preserve">, без </w:t>
+      </w:r>
+      <w:proofErr w:type="spellStart"/>
+      <w:r>
+        <w:rPr>
+          <w:sz w:val="28"/>
+          <w:szCs w:val="28"/>
+          <w:lang w:val="uk-UA"/>
+        </w:rPr>
+        <w:t>id</w:t>
+      </w:r>
+      <w:proofErr w:type="spellEnd"/>
+      <w:r>
+        <w:rPr>
+          <w:sz w:val="28"/>
+          <w:szCs w:val="28"/>
+          <w:lang w:val="uk-UA"/>
+        </w:rPr>
+        <w:t xml:space="preserve"> </w:t>
+      </w:r>
+      <w:r>
+        <w:rPr>
+          <w:sz w:val="28"/>
+          <w:szCs w:val="28"/>
+          <w:lang w:val="uk-UA"/>
+        </w:rPr>
+        <w:t>–</w:t>
+      </w:r>
+      <w:r>
+        <w:rPr>
+          <w:sz w:val="28"/>
+          <w:szCs w:val="28"/>
+          <w:lang w:val="uk-UA"/>
+        </w:rPr>
+        <w:t xml:space="preserve"> він передається окремо в URL.</w:t>
+      </w:r>
     </w:p>
     <w:sectPr>
       <w:pgSz w:w="11906" w:h="16838"/>
@@ -2242,6 +6124,25 @@
       <w:lang w:val="uk-UA"/>
     </w:rPr>
   </w:style>
+  <w:style w:type="table" w:styleId="a7">
+    <w:name w:val="Table Grid"/>
+    <w:basedOn w:val="a1"/>
+    <w:uiPriority w:val="39"/>
+    <w:rsid w:val="004C0CC4"/>
+    <w:pPr>
+      <w:spacing w:after="0" w:line="240" w:lineRule="auto"/>
+    </w:pPr>
+    <w:tblPr>
+      <w:tblBorders>
+        <w:top w:val="single" w:sz="4" w:space="0" w:color="auto"/>
+        <w:left w:val="single" w:sz="4" w:space="0" w:color="auto"/>
+        <w:bottom w:val="single" w:sz="4" w:space="0" w:color="auto"/>
+        <w:right w:val="single" w:sz="4" w:space="0" w:color="auto"/>
+        <w:insideH w:val="single" w:sz="4" w:space="0" w:color="auto"/>
+        <w:insideV w:val="single" w:sz="4" w:space="0" w:color="auto"/>
+      </w:tblBorders>
+    </w:tblPr>
+  </w:style>
 </w:styles>
 </file>
 

</xml_diff>

<commit_message>
Lab 5: Add todo creation with useMutation
</commit_message>
<xml_diff>
--- a/інтернет-програмування/Драч_ЛР№5_Звіт.docx
+++ b/інтернет-програмування/Драч_ЛР№5_Звіт.docx
@@ -10761,7 +10761,17 @@
           <w:lang w:val="uk-UA"/>
         </w:rPr>
         <w:lastRenderedPageBreak/>
-        <w:t>Етап №5</w:t>
+        <w:t>Етап №</w:t>
+      </w:r>
+      <w:r>
+        <w:rPr>
+          <w:b/>
+          <w:bCs/>
+          <w:sz w:val="28"/>
+          <w:szCs w:val="28"/>
+          <w:lang w:val="uk-UA"/>
+        </w:rPr>
+        <w:t>4-5</w:t>
       </w:r>
     </w:p>
     <w:p>
@@ -10773,6 +10783,120 @@
           <w:lang w:val="uk-UA"/>
         </w:rPr>
       </w:pPr>
+      <w:r>
+        <w:rPr>
+          <w:sz w:val="28"/>
+          <w:szCs w:val="28"/>
+          <w:lang w:val="uk-UA"/>
+        </w:rPr>
+        <w:t xml:space="preserve">Підключив </w:t>
+      </w:r>
+      <w:proofErr w:type="spellStart"/>
+      <w:r>
+        <w:rPr>
+          <w:sz w:val="28"/>
+          <w:szCs w:val="28"/>
+          <w:lang w:val="uk-UA"/>
+        </w:rPr>
+        <w:t>useQuery</w:t>
+      </w:r>
+      <w:proofErr w:type="spellEnd"/>
+      <w:r>
+        <w:rPr>
+          <w:sz w:val="28"/>
+          <w:szCs w:val="28"/>
+          <w:lang w:val="uk-UA"/>
+        </w:rPr>
+        <w:t xml:space="preserve"> з @tanstack/react-query. Викли</w:t>
+      </w:r>
+      <w:r>
+        <w:rPr>
+          <w:sz w:val="28"/>
+          <w:szCs w:val="28"/>
+          <w:lang w:val="uk-UA"/>
+        </w:rPr>
+        <w:t>кав</w:t>
+      </w:r>
+      <w:r>
+        <w:rPr>
+          <w:sz w:val="28"/>
+          <w:szCs w:val="28"/>
+          <w:lang w:val="uk-UA"/>
+        </w:rPr>
+        <w:t xml:space="preserve"> його з </w:t>
+      </w:r>
+      <w:proofErr w:type="spellStart"/>
+      <w:r>
+        <w:rPr>
+          <w:sz w:val="28"/>
+          <w:szCs w:val="28"/>
+          <w:lang w:val="uk-UA"/>
+        </w:rPr>
+        <w:t>queryKey</w:t>
+      </w:r>
+      <w:proofErr w:type="spellEnd"/>
+      <w:r>
+        <w:rPr>
+          <w:sz w:val="28"/>
+          <w:szCs w:val="28"/>
+          <w:lang w:val="uk-UA"/>
+        </w:rPr>
+        <w:t>: ["</w:t>
+      </w:r>
+      <w:proofErr w:type="spellStart"/>
+      <w:r>
+        <w:rPr>
+          <w:sz w:val="28"/>
+          <w:szCs w:val="28"/>
+          <w:lang w:val="uk-UA"/>
+        </w:rPr>
+        <w:t>todos</w:t>
+      </w:r>
+      <w:proofErr w:type="spellEnd"/>
+      <w:r>
+        <w:rPr>
+          <w:sz w:val="28"/>
+          <w:szCs w:val="28"/>
+          <w:lang w:val="uk-UA"/>
+        </w:rPr>
+        <w:t xml:space="preserve">"] та </w:t>
+      </w:r>
+      <w:proofErr w:type="spellStart"/>
+      <w:r>
+        <w:rPr>
+          <w:sz w:val="28"/>
+          <w:szCs w:val="28"/>
+          <w:lang w:val="uk-UA"/>
+        </w:rPr>
+        <w:t>queryFn</w:t>
+      </w:r>
+      <w:proofErr w:type="spellEnd"/>
+      <w:r>
+        <w:rPr>
+          <w:sz w:val="28"/>
+          <w:szCs w:val="28"/>
+          <w:lang w:val="uk-UA"/>
+        </w:rPr>
+        <w:t xml:space="preserve">, що звертається до </w:t>
+      </w:r>
+      <w:proofErr w:type="spellStart"/>
+      <w:r>
+        <w:rPr>
+          <w:sz w:val="28"/>
+          <w:szCs w:val="28"/>
+          <w:lang w:val="uk-UA"/>
+        </w:rPr>
+        <w:t>todosApi.getAll</w:t>
+      </w:r>
+      <w:proofErr w:type="spellEnd"/>
+      <w:r>
+        <w:rPr>
+          <w:sz w:val="28"/>
+          <w:szCs w:val="28"/>
+          <w:lang w:val="uk-UA"/>
+        </w:rPr>
+        <w:t>.</w:t>
+      </w:r>
     </w:p>
     <w:p>
       <w:pPr>
@@ -10783,6 +10907,181 @@
           <w:lang w:val="uk-UA"/>
         </w:rPr>
       </w:pPr>
+    </w:p>
+    <w:p>
+      <w:pPr>
+        <w:spacing w:after="0"/>
+        <w:rPr>
+          <w:sz w:val="28"/>
+          <w:szCs w:val="28"/>
+          <w:lang w:val="uk-UA"/>
+        </w:rPr>
+      </w:pPr>
+      <w:r>
+        <w:rPr>
+          <w:sz w:val="28"/>
+          <w:szCs w:val="28"/>
+          <w:lang w:val="uk-UA"/>
+        </w:rPr>
+        <w:t>Обро</w:t>
+      </w:r>
+      <w:r>
+        <w:rPr>
+          <w:sz w:val="28"/>
+          <w:szCs w:val="28"/>
+          <w:lang w:val="uk-UA"/>
+        </w:rPr>
+        <w:t>бив</w:t>
+      </w:r>
+      <w:r>
+        <w:rPr>
+          <w:sz w:val="28"/>
+          <w:szCs w:val="28"/>
+          <w:lang w:val="uk-UA"/>
+        </w:rPr>
+        <w:t xml:space="preserve"> усі три стани: відображ</w:t>
+      </w:r>
+      <w:r>
+        <w:rPr>
+          <w:sz w:val="28"/>
+          <w:szCs w:val="28"/>
+          <w:lang w:val="uk-UA"/>
+        </w:rPr>
+        <w:t>ення</w:t>
+      </w:r>
+      <w:r>
+        <w:rPr>
+          <w:sz w:val="28"/>
+          <w:szCs w:val="28"/>
+          <w:lang w:val="uk-UA"/>
+        </w:rPr>
+        <w:t xml:space="preserve"> індикатор</w:t>
+      </w:r>
+      <w:r>
+        <w:rPr>
+          <w:sz w:val="28"/>
+          <w:szCs w:val="28"/>
+          <w:lang w:val="uk-UA"/>
+        </w:rPr>
+        <w:t>у</w:t>
+      </w:r>
+      <w:r>
+        <w:rPr>
+          <w:sz w:val="28"/>
+          <w:szCs w:val="28"/>
+          <w:lang w:val="uk-UA"/>
+        </w:rPr>
+        <w:t xml:space="preserve"> завантаження поки </w:t>
+      </w:r>
+      <w:proofErr w:type="spellStart"/>
+      <w:r>
+        <w:rPr>
+          <w:sz w:val="28"/>
+          <w:szCs w:val="28"/>
+          <w:lang w:val="uk-UA"/>
+        </w:rPr>
+        <w:t>isLoading</w:t>
+      </w:r>
+      <w:proofErr w:type="spellEnd"/>
+      <w:r>
+        <w:rPr>
+          <w:sz w:val="28"/>
+          <w:szCs w:val="28"/>
+          <w:lang w:val="uk-UA"/>
+        </w:rPr>
+        <w:t xml:space="preserve"> === </w:t>
+      </w:r>
+      <w:proofErr w:type="spellStart"/>
+      <w:r>
+        <w:rPr>
+          <w:sz w:val="28"/>
+          <w:szCs w:val="28"/>
+          <w:lang w:val="uk-UA"/>
+        </w:rPr>
+        <w:t>true</w:t>
+      </w:r>
+      <w:proofErr w:type="spellEnd"/>
+      <w:r>
+        <w:rPr>
+          <w:sz w:val="28"/>
+          <w:szCs w:val="28"/>
+          <w:lang w:val="uk-UA"/>
+        </w:rPr>
+        <w:t xml:space="preserve">, повідомлення з текстом помилки якщо </w:t>
+      </w:r>
+      <w:proofErr w:type="spellStart"/>
+      <w:r>
+        <w:rPr>
+          <w:sz w:val="28"/>
+          <w:szCs w:val="28"/>
+          <w:lang w:val="uk-UA"/>
+        </w:rPr>
+        <w:t>isError</w:t>
+      </w:r>
+      <w:proofErr w:type="spellEnd"/>
+      <w:r>
+        <w:rPr>
+          <w:sz w:val="28"/>
+          <w:szCs w:val="28"/>
+          <w:lang w:val="uk-UA"/>
+        </w:rPr>
+        <w:t xml:space="preserve"> === </w:t>
+      </w:r>
+      <w:proofErr w:type="spellStart"/>
+      <w:r>
+        <w:rPr>
+          <w:sz w:val="28"/>
+          <w:szCs w:val="28"/>
+          <w:lang w:val="uk-UA"/>
+        </w:rPr>
+        <w:t>true</w:t>
+      </w:r>
+      <w:proofErr w:type="spellEnd"/>
+      <w:r>
+        <w:rPr>
+          <w:sz w:val="28"/>
+          <w:szCs w:val="28"/>
+          <w:lang w:val="uk-UA"/>
+        </w:rPr>
+        <w:t xml:space="preserve">, і список </w:t>
+      </w:r>
+      <w:proofErr w:type="spellStart"/>
+      <w:r>
+        <w:rPr>
+          <w:sz w:val="28"/>
+          <w:szCs w:val="28"/>
+          <w:lang w:val="uk-UA"/>
+        </w:rPr>
+        <w:t>todos</w:t>
+      </w:r>
+      <w:proofErr w:type="spellEnd"/>
+      <w:r>
+        <w:rPr>
+          <w:sz w:val="28"/>
+          <w:szCs w:val="28"/>
+          <w:lang w:val="uk-UA"/>
+        </w:rPr>
+        <w:t xml:space="preserve"> після успішного завантаження.</w:t>
+      </w:r>
+    </w:p>
+    <w:p>
+      <w:pPr>
+        <w:spacing w:after="0"/>
+        <w:rPr>
+          <w:sz w:val="28"/>
+          <w:szCs w:val="28"/>
+        </w:rPr>
+      </w:pPr>
+    </w:p>
+    <w:p>
+      <w:pPr>
+        <w:spacing w:after="0"/>
+        <w:rPr>
+          <w:sz w:val="28"/>
+          <w:szCs w:val="28"/>
+          <w:lang w:val="uk-UA"/>
+        </w:rPr>
+      </w:pPr>
       <w:proofErr w:type="spellStart"/>
       <w:r>
         <w:rPr>
@@ -10805,15 +11104,15 @@
           <w:sz w:val="28"/>
           <w:szCs w:val="28"/>
         </w:rPr>
-        <w:t xml:space="preserve"> к</w:t>
-      </w:r>
-      <w:proofErr w:type="spellStart"/>
-      <w:r>
-        <w:rPr>
-          <w:sz w:val="28"/>
-          <w:szCs w:val="28"/>
-        </w:rPr>
-        <w:t>ерований</w:t>
+        <w:t xml:space="preserve"> </w:t>
+      </w:r>
+      <w:proofErr w:type="spellStart"/>
+      <w:r>
+        <w:rPr>
+          <w:sz w:val="28"/>
+          <w:szCs w:val="28"/>
+        </w:rPr>
+        <w:t>керований</w:t>
       </w:r>
       <w:proofErr w:type="spellEnd"/>
       <w:r>
@@ -14190,6 +14489,7 @@
           <w:szCs w:val="21"/>
           <w:lang w:val="en-US" w:eastAsia="ru-RU"/>
         </w:rPr>
+        <w:lastRenderedPageBreak/>
         <w:t xml:space="preserve">  </w:t>
       </w:r>
       <w:r>
@@ -15004,7 +15304,6 @@
           <w:szCs w:val="21"/>
           <w:lang w:val="en-US" w:eastAsia="ru-RU"/>
         </w:rPr>
-        <w:lastRenderedPageBreak/>
         <w:t xml:space="preserve">        </w:t>
       </w:r>
       <w:r>
@@ -18054,6 +18353,7 @@
           <w:szCs w:val="21"/>
           <w:lang w:val="en-US" w:eastAsia="ru-RU"/>
         </w:rPr>
+        <w:lastRenderedPageBreak/>
         <w:t xml:space="preserve">  </w:t>
       </w:r>
       <w:r>
@@ -18458,6 +18758,46 @@
           <w:szCs w:val="28"/>
         </w:rPr>
       </w:pPr>
+      <w:r>
+        <w:rPr>
+          <w:noProof/>
+        </w:rPr>
+        <w:drawing>
+          <wp:inline distT="0" distB="0" distL="0" distR="0" wp14:anchorId="4FCCC696" wp14:editId="3D2BCF5F">
+            <wp:extent cx="6645910" cy="2379345"/>
+            <wp:effectExtent l="0" t="0" r="2540" b="1905"/>
+            <wp:docPr id="17" name="Рисунок 17"/>
+            <wp:cNvGraphicFramePr>
+              <a:graphicFrameLocks xmlns:a="http://schemas.openxmlformats.org/drawingml/2006/main" noChangeAspect="1"/>
+            </wp:cNvGraphicFramePr>
+            <a:graphic xmlns:a="http://schemas.openxmlformats.org/drawingml/2006/main">
+              <a:graphicData uri="http://schemas.openxmlformats.org/drawingml/2006/picture">
+                <pic:pic xmlns:pic="http://schemas.openxmlformats.org/drawingml/2006/picture">
+                  <pic:nvPicPr>
+                    <pic:cNvPr id="1" name=""/>
+                    <pic:cNvPicPr/>
+                  </pic:nvPicPr>
+                  <pic:blipFill>
+                    <a:blip r:embed="rId19"/>
+                    <a:stretch>
+                      <a:fillRect/>
+                    </a:stretch>
+                  </pic:blipFill>
+                  <pic:spPr>
+                    <a:xfrm>
+                      <a:off x="0" y="0"/>
+                      <a:ext cx="6645910" cy="2379345"/>
+                    </a:xfrm>
+                    <a:prstGeom prst="rect">
+                      <a:avLst/>
+                    </a:prstGeom>
+                  </pic:spPr>
+                </pic:pic>
+              </a:graphicData>
+            </a:graphic>
+          </wp:inline>
+        </w:drawing>
+      </w:r>
     </w:p>
     <w:p>
       <w:pPr>
@@ -18475,6 +18815,74 @@
         <w:rPr>
           <w:sz w:val="28"/>
           <w:szCs w:val="28"/>
+          <w:lang w:val="uk-UA"/>
+        </w:rPr>
+      </w:pPr>
+      <w:r>
+        <w:rPr>
+          <w:sz w:val="28"/>
+          <w:szCs w:val="28"/>
+          <w:lang w:val="uk-UA"/>
+        </w:rPr>
+        <w:t>Зафіксував зміни:</w:t>
+      </w:r>
+    </w:p>
+    <w:p>
+      <w:pPr>
+        <w:spacing w:after="0"/>
+        <w:rPr>
+          <w:sz w:val="28"/>
+          <w:szCs w:val="28"/>
+          <w:lang w:val="uk-UA"/>
+        </w:rPr>
+      </w:pPr>
+      <w:r>
+        <w:rPr>
+          <w:noProof/>
+        </w:rPr>
+        <w:drawing>
+          <wp:inline distT="0" distB="0" distL="0" distR="0" wp14:anchorId="367D273C" wp14:editId="3AF12BB3">
+            <wp:extent cx="6645910" cy="1599565"/>
+            <wp:effectExtent l="0" t="0" r="2540" b="635"/>
+            <wp:docPr id="18" name="Рисунок 18"/>
+            <wp:cNvGraphicFramePr>
+              <a:graphicFrameLocks xmlns:a="http://schemas.openxmlformats.org/drawingml/2006/main" noChangeAspect="1"/>
+            </wp:cNvGraphicFramePr>
+            <a:graphic xmlns:a="http://schemas.openxmlformats.org/drawingml/2006/main">
+              <a:graphicData uri="http://schemas.openxmlformats.org/drawingml/2006/picture">
+                <pic:pic xmlns:pic="http://schemas.openxmlformats.org/drawingml/2006/picture">
+                  <pic:nvPicPr>
+                    <pic:cNvPr id="1" name=""/>
+                    <pic:cNvPicPr/>
+                  </pic:nvPicPr>
+                  <pic:blipFill>
+                    <a:blip r:embed="rId20"/>
+                    <a:stretch>
+                      <a:fillRect/>
+                    </a:stretch>
+                  </pic:blipFill>
+                  <pic:spPr>
+                    <a:xfrm>
+                      <a:off x="0" y="0"/>
+                      <a:ext cx="6645910" cy="1599565"/>
+                    </a:xfrm>
+                    <a:prstGeom prst="rect">
+                      <a:avLst/>
+                    </a:prstGeom>
+                  </pic:spPr>
+                </pic:pic>
+              </a:graphicData>
+            </a:graphic>
+          </wp:inline>
+        </w:drawing>
+      </w:r>
+    </w:p>
+    <w:p>
+      <w:pPr>
+        <w:spacing w:after="0"/>
+        <w:rPr>
+          <w:sz w:val="28"/>
+          <w:szCs w:val="28"/>
           <w:lang w:val="en-US"/>
         </w:rPr>
       </w:pPr>
@@ -18483,11 +18891,41 @@
       <w:pPr>
         <w:spacing w:after="0"/>
         <w:rPr>
-          <w:sz w:val="28"/>
-          <w:szCs w:val="28"/>
-          <w:lang w:val="en-US"/>
-        </w:rPr>
-      </w:pPr>
+          <w:b/>
+          <w:bCs/>
+          <w:sz w:val="28"/>
+          <w:szCs w:val="28"/>
+        </w:rPr>
+      </w:pPr>
+      <w:proofErr w:type="spellStart"/>
+      <w:r>
+        <w:rPr>
+          <w:b/>
+          <w:bCs/>
+          <w:sz w:val="28"/>
+          <w:szCs w:val="28"/>
+        </w:rPr>
+        <w:t>Етап</w:t>
+      </w:r>
+      <w:proofErr w:type="spellEnd"/>
+      <w:r>
+        <w:rPr>
+          <w:b/>
+          <w:bCs/>
+          <w:sz w:val="28"/>
+          <w:szCs w:val="28"/>
+        </w:rPr>
+        <w:t xml:space="preserve"> №</w:t>
+      </w:r>
+      <w:r>
+        <w:rPr>
+          <w:b/>
+          <w:bCs/>
+          <w:sz w:val="28"/>
+          <w:szCs w:val="28"/>
+        </w:rPr>
+        <w:t>6</w:t>
+      </w:r>
     </w:p>
     <w:p>
       <w:pPr>
@@ -18495,7 +18933,7 @@
         <w:rPr>
           <w:sz w:val="28"/>
           <w:szCs w:val="28"/>
-          <w:lang w:val="en-US"/>
+          <w:lang w:val="uk-UA"/>
         </w:rPr>
       </w:pPr>
     </w:p>
@@ -18505,7 +18943,43 @@
         <w:rPr>
           <w:sz w:val="28"/>
           <w:szCs w:val="28"/>
-          <w:lang w:val="en-US"/>
+          <w:lang w:val="uk-UA"/>
+        </w:rPr>
+      </w:pPr>
+    </w:p>
+    <w:p>
+      <w:pPr>
+        <w:spacing w:after="0"/>
+        <w:rPr>
+          <w:sz w:val="28"/>
+          <w:szCs w:val="28"/>
+        </w:rPr>
+      </w:pPr>
+    </w:p>
+    <w:p>
+      <w:pPr>
+        <w:spacing w:after="0"/>
+        <w:rPr>
+          <w:sz w:val="28"/>
+          <w:szCs w:val="28"/>
+        </w:rPr>
+      </w:pPr>
+    </w:p>
+    <w:p>
+      <w:pPr>
+        <w:spacing w:after="0"/>
+        <w:rPr>
+          <w:sz w:val="28"/>
+          <w:szCs w:val="28"/>
+        </w:rPr>
+      </w:pPr>
+    </w:p>
+    <w:p>
+      <w:pPr>
+        <w:spacing w:after="0"/>
+        <w:rPr>
+          <w:sz w:val="28"/>
+          <w:szCs w:val="28"/>
         </w:rPr>
       </w:pPr>
     </w:p>
@@ -18917,6 +19391,7 @@
   <w:style w:type="paragraph" w:default="1" w:styleId="a">
     <w:name w:val="Normal"/>
     <w:qFormat/>
+    <w:rsid w:val="00510D48"/>
   </w:style>
   <w:style w:type="character" w:default="1" w:styleId="a0">
     <w:name w:val="Default Paragraph Font"/>

</xml_diff>